<commit_message>
Add fault scenario extension section to voltage survey
Section 6 adds comprehensive fault analysis covering:
- 6.1 Impact of N-1 faults on the three-stage framework (table)
- 6.2 SOP topology-switching model (Eqs F1-F3, Paper 6)
- 6.3 FIDVR suppression via ESS+STL control (Eqs F4-F6, Paper 15)
- 6.4 PV LVRT reactive current injection (Eqs F7-F8, Paper 23)
- 6.5 N-1 safety constraints in pre-stage LP (Eqs F9-F11, Papers 3/20)
- 6.6 Post-fault sensitivity matrix re-identification (Eqs F12-F14, Paper 22)
- 6.7 DR-MPC fault robustness extension (Eqs F15-F16, Papers 18/25)
- 6.8 Comparative table of 8 fault-relevant papers

References extended from 4 to 11 entries.
File size: 16,246 -> 24,077 bytes; parts: 278 (was ~200).

https://claude.ai/code/session_0124gQ7f6mZuZqhHmiosbYQs
</commit_message>
<xml_diff>
--- a/paper/voltage_survey.docx
+++ b/paper/voltage_survey.docx
@@ -5539,6 +5539,4123 @@
           <w:color w:val="1F3864"/>
           <w:rFonts w:hint="eastAsia" w:eastAsia="宋体" w:ascii="Times New Roman" w:hAnsi="Times New Roman"/>
         </w:rPr>
+        <w:t xml:space="preserve">6  故障情景下的电压调节扩展分析</w:t>
+      </w:r>
+    </w:p>
+    <w:p>
+      <w:pPr>
+        <w:jc w:val="left"/>
+        <w:spacing w:before="200" w:after="80"/>
+      </w:pPr>
+      <w:r>
+        <w:rPr>
+          <w:b/>
+          <w:bCs/>
+          <w:sz w:val="26"/>
+          <w:szCs w:val="26"/>
+          <w:color w:val="2E75B6"/>
+          <w:rFonts w:hint="eastAsia" w:eastAsia="宋体" w:ascii="Times New Roman" w:hAnsi="Times New Roman"/>
+        </w:rPr>
+        <w:t xml:space="preserve">6.1  故障情景对三阶段框架的影响</w:t>
+      </w:r>
+    </w:p>
+    <w:p>
+      <w:pPr>
+        <w:jc w:val="both"/>
+        <w:spacing w:before="0" w:after="60"/>
+        <w:ind w:left="0" w:firstLine="420"/>
+      </w:pPr>
+      <w:r>
+        <w:rPr>
+          <w:sz w:val="20"/>
+          <w:szCs w:val="20"/>
+          <w:rFonts w:hint="eastAsia" w:eastAsia="宋体" w:ascii="Times New Roman" w:hAnsi="Times New Roman"/>
+        </w:rPr>
+        <w:t xml:space="preserve">三阶段框架基于LinDistFlow线性化模型，假设网络拓扑固定，电压灵敏度矩阵S(t)在整个调度周期内平滑演化。当配电网发生N-1故障（支路开断）时，拓扑结构产生离散跳变，对框架三个阶段均造成本质性冲击：（a）事前预规划阶段——正常拓扑T_0下的优化结果在故障拓扑T^(k)下可能严重越限，需补充N-1预想故障约束；（b）事中RLS更新阶段——平滑递推假设S(t)连续变化，拓扑突变导致灵敏度矩阵离散跳变，RLS追踪失效；（c）事件触发重规划阶段——当前触发指标g(t)仅感知约束趋紧度，无法直接感知故障，故障信号应作为独立触发条件补充。结合28篇文献中相关工作，本节从四个维度梳理故障场景扩展：拓扑切换（文献6）、FIDVR抑制与PV低穿（文献15、23）、预规划N-1安全约束（文献3、20）、灵敏度矩阵重辨识（文献22扩展）。</w:t>
+      </w:r>
+    </w:p>
+    <w:tbl>
+      <w:tblPr>
+        <w:tblStyle w:val="TableNormal"/>
+        <w:tblW w:w="8900" w:type="dxa"/>
+        <w:tblBorders>
+          <w:top w:val="single" w:sz="4" w:space="0" w:color="2E75B6"/>
+          <w:left w:val="single" w:sz="4" w:space="0" w:color="2E75B6"/>
+          <w:bottom w:val="single" w:sz="4" w:space="0" w:color="2E75B6"/>
+          <w:right w:val="single" w:sz="4" w:space="0" w:color="2E75B6"/>
+          <w:insideH w:val="single" w:sz="4" w:space="0" w:color="2E75B6"/>
+          <w:insideV w:val="single" w:sz="4" w:space="0" w:color="2E75B6"/>
+        </w:tblBorders>
+      </w:tblPr>
+      <w:tr>
+        <w:tc>
+          <w:tcPr>
+            <w:tcW w:w="1500" w:type="dxa"/>
+            <w:shd w:val="clear" w:color="auto" w:fill="D9E1F2"/>
+          </w:tcPr>
+          <w:p>
+            <w:pPr>
+              <w:jc w:val="center"/>
+              <w:spacing w:before="40" w:after="40"/>
+            </w:pPr>
+            <w:r>
+              <w:rPr>
+                <w:b/>
+                <w:bCs/>
+                <w:sz w:val="18"/>
+                <w:szCs w:val="18"/>
+                <w:rFonts w:hint="eastAsia" w:eastAsia="宋体" w:ascii="Times New Roman" w:hAnsi="Times New Roman"/>
+              </w:rPr>
+              <w:t xml:space="preserve">框架阶段</w:t>
+            </w:r>
+          </w:p>
+        </w:tc>
+        <w:tc>
+          <w:tcPr>
+            <w:tcW w:w="1850" w:type="dxa"/>
+            <w:shd w:val="clear" w:color="auto" w:fill="D9E1F2"/>
+          </w:tcPr>
+          <w:p>
+            <w:pPr>
+              <w:jc w:val="center"/>
+              <w:spacing w:before="40" w:after="40"/>
+            </w:pPr>
+            <w:r>
+              <w:rPr>
+                <w:b/>
+                <w:bCs/>
+                <w:sz w:val="18"/>
+                <w:szCs w:val="18"/>
+                <w:rFonts w:hint="eastAsia" w:eastAsia="宋体" w:ascii="Times New Roman" w:hAnsi="Times New Roman"/>
+              </w:rPr>
+              <w:t xml:space="preserve">正常工况</w:t>
+            </w:r>
+          </w:p>
+        </w:tc>
+        <w:tc>
+          <w:tcPr>
+            <w:tcW w:w="1850" w:type="dxa"/>
+            <w:shd w:val="clear" w:color="auto" w:fill="D9E1F2"/>
+          </w:tcPr>
+          <w:p>
+            <w:pPr>
+              <w:jc w:val="center"/>
+              <w:spacing w:before="40" w:after="40"/>
+            </w:pPr>
+            <w:r>
+              <w:rPr>
+                <w:b/>
+                <w:bCs/>
+                <w:sz w:val="18"/>
+                <w:szCs w:val="18"/>
+                <w:rFonts w:hint="eastAsia" w:eastAsia="宋体" w:ascii="Times New Roman" w:hAnsi="Times New Roman"/>
+              </w:rPr>
+              <w:t xml:space="preserve">故障工况冲击</w:t>
+            </w:r>
+          </w:p>
+        </w:tc>
+        <w:tc>
+          <w:tcPr>
+            <w:tcW w:w="1850" w:type="dxa"/>
+            <w:shd w:val="clear" w:color="auto" w:fill="D9E1F2"/>
+          </w:tcPr>
+          <w:p>
+            <w:pPr>
+              <w:jc w:val="center"/>
+              <w:spacing w:before="40" w:after="40"/>
+            </w:pPr>
+            <w:r>
+              <w:rPr>
+                <w:b/>
+                <w:bCs/>
+                <w:sz w:val="18"/>
+                <w:szCs w:val="18"/>
+                <w:rFonts w:hint="eastAsia" w:eastAsia="宋体" w:ascii="Times New Roman" w:hAnsi="Times New Roman"/>
+              </w:rPr>
+              <w:t xml:space="preserve">扩展方案</w:t>
+            </w:r>
+          </w:p>
+        </w:tc>
+        <w:tc>
+          <w:tcPr>
+            <w:tcW w:w="1850" w:type="dxa"/>
+            <w:shd w:val="clear" w:color="auto" w:fill="D9E1F2"/>
+          </w:tcPr>
+          <w:p>
+            <w:pPr>
+              <w:jc w:val="center"/>
+              <w:spacing w:before="40" w:after="40"/>
+            </w:pPr>
+            <w:r>
+              <w:rPr>
+                <w:b/>
+                <w:bCs/>
+                <w:sz w:val="18"/>
+                <w:szCs w:val="18"/>
+                <w:rFonts w:hint="eastAsia" w:eastAsia="宋体" w:ascii="Times New Roman" w:hAnsi="Times New Roman"/>
+              </w:rPr>
+              <w:t xml:space="preserve">引用文献</w:t>
+            </w:r>
+          </w:p>
+        </w:tc>
+      </w:tr>
+      <w:tr>
+        <w:tc>
+          <w:tcPr>
+            <w:tcW w:w="1500" w:type="dxa"/>
+            <w:shd w:val="clear" w:color="auto" w:fill="EBF3FA"/>
+          </w:tcPr>
+          <w:p>
+            <w:pPr>
+              <w:jc w:val="center"/>
+              <w:spacing w:before="40" w:after="40"/>
+            </w:pPr>
+            <w:r>
+              <w:rPr>
+                <w:b/>
+                <w:bCs/>
+                <w:sz w:val="18"/>
+                <w:szCs w:val="18"/>
+                <w:rFonts w:hint="eastAsia" w:eastAsia="宋体" w:ascii="Times New Roman" w:hAnsi="Times New Roman"/>
+              </w:rPr>
+              <w:t xml:space="preserve">事前预规划</w:t>
+            </w:r>
+          </w:p>
+        </w:tc>
+        <w:tc>
+          <w:tcPr>
+            <w:tcW w:w="1850" w:type="dxa"/>
+            <w:shd w:val="clear" w:color="auto" w:fill="FFFFFF"/>
+          </w:tcPr>
+          <w:p>
+            <w:pPr>
+              <w:jc w:val="center"/>
+              <w:spacing w:before="40" w:after="40"/>
+            </w:pPr>
+            <w:r>
+              <w:rPr>
+                <w:sz w:val="18"/>
+                <w:szCs w:val="18"/>
+                <w:rFonts w:hint="eastAsia" w:eastAsia="宋体" w:ascii="Times New Roman" w:hAnsi="Times New Roman"/>
+              </w:rPr>
+              <w:t xml:space="preserve">LP在T0下优化P_h</w:t>
+            </w:r>
+          </w:p>
+        </w:tc>
+        <w:tc>
+          <w:tcPr>
+            <w:tcW w:w="1850" w:type="dxa"/>
+            <w:shd w:val="clear" w:color="auto" w:fill="FFFFFF"/>
+          </w:tcPr>
+          <w:p>
+            <w:pPr>
+              <w:jc w:val="center"/>
+              <w:spacing w:before="40" w:after="40"/>
+            </w:pPr>
+            <w:r>
+              <w:rPr>
+                <w:sz w:val="18"/>
+                <w:szCs w:val="18"/>
+                <w:rFonts w:hint="eastAsia" w:eastAsia="宋体" w:ascii="Times New Roman" w:hAnsi="Times New Roman"/>
+              </w:rPr>
+              <w:t xml:space="preserve">故障拓扑下约束失效</w:t>
+            </w:r>
+          </w:p>
+        </w:tc>
+        <w:tc>
+          <w:tcPr>
+            <w:tcW w:w="1850" w:type="dxa"/>
+            <w:shd w:val="clear" w:color="auto" w:fill="FFFFFF"/>
+          </w:tcPr>
+          <w:p>
+            <w:pPr>
+              <w:jc w:val="center"/>
+              <w:spacing w:before="40" w:after="40"/>
+            </w:pPr>
+            <w:r>
+              <w:rPr>
+                <w:sz w:val="18"/>
+                <w:szCs w:val="18"/>
+                <w:rFonts w:hint="eastAsia" w:eastAsia="宋体" w:ascii="Times New Roman" w:hAnsi="Times New Roman"/>
+              </w:rPr>
+              <w:t xml:space="preserve">N-1安全约束(F9)</w:t>
+            </w:r>
+          </w:p>
+        </w:tc>
+        <w:tc>
+          <w:tcPr>
+            <w:tcW w:w="1850" w:type="dxa"/>
+            <w:shd w:val="clear" w:color="auto" w:fill="FFFFFF"/>
+          </w:tcPr>
+          <w:p>
+            <w:pPr>
+              <w:jc w:val="center"/>
+              <w:spacing w:before="40" w:after="40"/>
+            </w:pPr>
+            <w:r>
+              <w:rPr>
+                <w:sz w:val="18"/>
+                <w:szCs w:val="18"/>
+                <w:rFonts w:hint="eastAsia" w:eastAsia="宋体" w:ascii="Times New Roman" w:hAnsi="Times New Roman"/>
+              </w:rPr>
+              <w:t xml:space="preserve">文献3/20</w:t>
+            </w:r>
+          </w:p>
+        </w:tc>
+      </w:tr>
+      <w:tr>
+        <w:tc>
+          <w:tcPr>
+            <w:tcW w:w="1500" w:type="dxa"/>
+            <w:shd w:val="clear" w:color="auto" w:fill="EBF3FA"/>
+          </w:tcPr>
+          <w:p>
+            <w:pPr>
+              <w:jc w:val="center"/>
+              <w:spacing w:before="40" w:after="40"/>
+            </w:pPr>
+            <w:r>
+              <w:rPr>
+                <w:b/>
+                <w:bCs/>
+                <w:sz w:val="18"/>
+                <w:szCs w:val="18"/>
+                <w:rFonts w:hint="eastAsia" w:eastAsia="宋体" w:ascii="Times New Roman" w:hAnsi="Times New Roman"/>
+              </w:rPr>
+              <w:t xml:space="preserve">事中RLS更新</w:t>
+            </w:r>
+          </w:p>
+        </w:tc>
+        <w:tc>
+          <w:tcPr>
+            <w:tcW w:w="1850" w:type="dxa"/>
+            <w:shd w:val="clear" w:color="auto" w:fill="FFFFFF"/>
+          </w:tcPr>
+          <w:p>
+            <w:pPr>
+              <w:jc w:val="center"/>
+              <w:spacing w:before="40" w:after="40"/>
+            </w:pPr>
+            <w:r>
+              <w:rPr>
+                <w:sz w:val="18"/>
+                <w:szCs w:val="18"/>
+                <w:rFonts w:hint="eastAsia" w:eastAsia="宋体" w:ascii="Times New Roman" w:hAnsi="Times New Roman"/>
+              </w:rPr>
+              <w:t xml:space="preserve">S(t)平滑递推</w:t>
+            </w:r>
+          </w:p>
+        </w:tc>
+        <w:tc>
+          <w:tcPr>
+            <w:tcW w:w="1850" w:type="dxa"/>
+            <w:shd w:val="clear" w:color="auto" w:fill="FFFFFF"/>
+          </w:tcPr>
+          <w:p>
+            <w:pPr>
+              <w:jc w:val="center"/>
+              <w:spacing w:before="40" w:after="40"/>
+            </w:pPr>
+            <w:r>
+              <w:rPr>
+                <w:sz w:val="18"/>
+                <w:szCs w:val="18"/>
+                <w:rFonts w:hint="eastAsia" w:eastAsia="宋体" w:ascii="Times New Roman" w:hAnsi="Times New Roman"/>
+              </w:rPr>
+              <w:t xml:space="preserve">拓扑突变S(t)跳变</w:t>
+            </w:r>
+          </w:p>
+        </w:tc>
+        <w:tc>
+          <w:tcPr>
+            <w:tcW w:w="1850" w:type="dxa"/>
+            <w:shd w:val="clear" w:color="auto" w:fill="FFFFFF"/>
+          </w:tcPr>
+          <w:p>
+            <w:pPr>
+              <w:jc w:val="center"/>
+              <w:spacing w:before="40" w:after="40"/>
+            </w:pPr>
+            <w:r>
+              <w:rPr>
+                <w:sz w:val="18"/>
+                <w:szCs w:val="18"/>
+                <w:rFonts w:hint="eastAsia" w:eastAsia="宋体" w:ascii="Times New Roman" w:hAnsi="Times New Roman"/>
+              </w:rPr>
+              <w:t xml:space="preserve">突变检测+重辨识</w:t>
+            </w:r>
+          </w:p>
+        </w:tc>
+        <w:tc>
+          <w:tcPr>
+            <w:tcW w:w="1850" w:type="dxa"/>
+            <w:shd w:val="clear" w:color="auto" w:fill="FFFFFF"/>
+          </w:tcPr>
+          <w:p>
+            <w:pPr>
+              <w:jc w:val="center"/>
+              <w:spacing w:before="40" w:after="40"/>
+            </w:pPr>
+            <w:r>
+              <w:rPr>
+                <w:sz w:val="18"/>
+                <w:szCs w:val="18"/>
+                <w:rFonts w:hint="eastAsia" w:eastAsia="宋体" w:ascii="Times New Roman" w:hAnsi="Times New Roman"/>
+              </w:rPr>
+              <w:t xml:space="preserve">文献22</w:t>
+            </w:r>
+          </w:p>
+        </w:tc>
+      </w:tr>
+      <w:tr>
+        <w:tc>
+          <w:tcPr>
+            <w:tcW w:w="1500" w:type="dxa"/>
+            <w:shd w:val="clear" w:color="auto" w:fill="EBF3FA"/>
+          </w:tcPr>
+          <w:p>
+            <w:pPr>
+              <w:jc w:val="center"/>
+              <w:spacing w:before="40" w:after="40"/>
+            </w:pPr>
+            <w:r>
+              <w:rPr>
+                <w:b/>
+                <w:bCs/>
+                <w:sz w:val="18"/>
+                <w:szCs w:val="18"/>
+                <w:rFonts w:hint="eastAsia" w:eastAsia="宋体" w:ascii="Times New Roman" w:hAnsi="Times New Roman"/>
+              </w:rPr>
+              <w:t xml:space="preserve">事件触发</w:t>
+            </w:r>
+          </w:p>
+        </w:tc>
+        <w:tc>
+          <w:tcPr>
+            <w:tcW w:w="1850" w:type="dxa"/>
+            <w:shd w:val="clear" w:color="auto" w:fill="FFFFFF"/>
+          </w:tcPr>
+          <w:p>
+            <w:pPr>
+              <w:jc w:val="center"/>
+              <w:spacing w:before="40" w:after="40"/>
+            </w:pPr>
+            <w:r>
+              <w:rPr>
+                <w:sz w:val="18"/>
+                <w:szCs w:val="18"/>
+                <w:rFonts w:hint="eastAsia" w:eastAsia="宋体" w:ascii="Times New Roman" w:hAnsi="Times New Roman"/>
+              </w:rPr>
+              <w:t xml:space="preserve">g(t)&gt;=eta感知趋紧</w:t>
+            </w:r>
+          </w:p>
+        </w:tc>
+        <w:tc>
+          <w:tcPr>
+            <w:tcW w:w="1850" w:type="dxa"/>
+            <w:shd w:val="clear" w:color="auto" w:fill="FFFFFF"/>
+          </w:tcPr>
+          <w:p>
+            <w:pPr>
+              <w:jc w:val="center"/>
+              <w:spacing w:before="40" w:after="40"/>
+            </w:pPr>
+            <w:r>
+              <w:rPr>
+                <w:sz w:val="18"/>
+                <w:szCs w:val="18"/>
+                <w:rFonts w:hint="eastAsia" w:eastAsia="宋体" w:ascii="Times New Roman" w:hAnsi="Times New Roman"/>
+              </w:rPr>
+              <w:t xml:space="preserve">无法感知故障信号</w:t>
+            </w:r>
+          </w:p>
+        </w:tc>
+        <w:tc>
+          <w:tcPr>
+            <w:tcW w:w="1850" w:type="dxa"/>
+            <w:shd w:val="clear" w:color="auto" w:fill="FFFFFF"/>
+          </w:tcPr>
+          <w:p>
+            <w:pPr>
+              <w:jc w:val="center"/>
+              <w:spacing w:before="40" w:after="40"/>
+            </w:pPr>
+            <w:r>
+              <w:rPr>
+                <w:sz w:val="18"/>
+                <w:szCs w:val="18"/>
+                <w:rFonts w:hint="eastAsia" w:eastAsia="宋体" w:ascii="Times New Roman" w:hAnsi="Times New Roman"/>
+              </w:rPr>
+              <w:t xml:space="preserve">新增故障触发条件</w:t>
+            </w:r>
+          </w:p>
+        </w:tc>
+        <w:tc>
+          <w:tcPr>
+            <w:tcW w:w="1850" w:type="dxa"/>
+            <w:shd w:val="clear" w:color="auto" w:fill="FFFFFF"/>
+          </w:tcPr>
+          <w:p>
+            <w:pPr>
+              <w:jc w:val="center"/>
+              <w:spacing w:before="40" w:after="40"/>
+            </w:pPr>
+            <w:r>
+              <w:rPr>
+                <w:sz w:val="18"/>
+                <w:szCs w:val="18"/>
+                <w:rFonts w:hint="eastAsia" w:eastAsia="宋体" w:ascii="Times New Roman" w:hAnsi="Times New Roman"/>
+              </w:rPr>
+              <w:t xml:space="preserve">文献6</w:t>
+            </w:r>
+          </w:p>
+        </w:tc>
+      </w:tr>
+      <w:tr>
+        <w:tc>
+          <w:tcPr>
+            <w:tcW w:w="1500" w:type="dxa"/>
+            <w:shd w:val="clear" w:color="auto" w:fill="EBF3FA"/>
+          </w:tcPr>
+          <w:p>
+            <w:pPr>
+              <w:jc w:val="center"/>
+              <w:spacing w:before="40" w:after="40"/>
+            </w:pPr>
+            <w:r>
+              <w:rPr>
+                <w:b/>
+                <w:bCs/>
+                <w:sz w:val="18"/>
+                <w:szCs w:val="18"/>
+                <w:rFonts w:hint="eastAsia" w:eastAsia="宋体" w:ascii="Times New Roman" w:hAnsi="Times New Roman"/>
+              </w:rPr>
+              <w:t xml:space="preserve">重规划</w:t>
+            </w:r>
+          </w:p>
+        </w:tc>
+        <w:tc>
+          <w:tcPr>
+            <w:tcW w:w="1850" w:type="dxa"/>
+            <w:shd w:val="clear" w:color="auto" w:fill="FFFFFF"/>
+          </w:tcPr>
+          <w:p>
+            <w:pPr>
+              <w:jc w:val="center"/>
+              <w:spacing w:before="40" w:after="40"/>
+            </w:pPr>
+            <w:r>
+              <w:rPr>
+                <w:sz w:val="18"/>
+                <w:szCs w:val="18"/>
+                <w:rFonts w:hint="eastAsia" w:eastAsia="宋体" w:ascii="Times New Roman" w:hAnsi="Times New Roman"/>
+              </w:rPr>
+              <w:t xml:space="preserve">T0下水电再调度</w:t>
+            </w:r>
+          </w:p>
+        </w:tc>
+        <w:tc>
+          <w:tcPr>
+            <w:tcW w:w="1850" w:type="dxa"/>
+            <w:shd w:val="clear" w:color="auto" w:fill="FFFFFF"/>
+          </w:tcPr>
+          <w:p>
+            <w:pPr>
+              <w:jc w:val="center"/>
+              <w:spacing w:before="40" w:after="40"/>
+            </w:pPr>
+            <w:r>
+              <w:rPr>
+                <w:sz w:val="18"/>
+                <w:szCs w:val="18"/>
+                <w:rFonts w:hint="eastAsia" w:eastAsia="宋体" w:ascii="Times New Roman" w:hAnsi="Times New Roman"/>
+              </w:rPr>
+              <w:t xml:space="preserve">T^(k)约束结构改变</w:t>
+            </w:r>
+          </w:p>
+        </w:tc>
+        <w:tc>
+          <w:tcPr>
+            <w:tcW w:w="1850" w:type="dxa"/>
+            <w:shd w:val="clear" w:color="auto" w:fill="FFFFFF"/>
+          </w:tcPr>
+          <w:p>
+            <w:pPr>
+              <w:jc w:val="center"/>
+              <w:spacing w:before="40" w:after="40"/>
+            </w:pPr>
+            <w:r>
+              <w:rPr>
+                <w:sz w:val="18"/>
+                <w:szCs w:val="18"/>
+                <w:rFonts w:hint="eastAsia" w:eastAsia="宋体" w:ascii="Times New Roman" w:hAnsi="Times New Roman"/>
+              </w:rPr>
+              <w:t xml:space="preserve">基于T^(k)重建LP</w:t>
+            </w:r>
+          </w:p>
+        </w:tc>
+        <w:tc>
+          <w:tcPr>
+            <w:tcW w:w="1850" w:type="dxa"/>
+            <w:shd w:val="clear" w:color="auto" w:fill="FFFFFF"/>
+          </w:tcPr>
+          <w:p>
+            <w:pPr>
+              <w:jc w:val="center"/>
+              <w:spacing w:before="40" w:after="40"/>
+            </w:pPr>
+            <w:r>
+              <w:rPr>
+                <w:sz w:val="18"/>
+                <w:szCs w:val="18"/>
+                <w:rFonts w:hint="eastAsia" w:eastAsia="宋体" w:ascii="Times New Roman" w:hAnsi="Times New Roman"/>
+              </w:rPr>
+              <w:t xml:space="preserve">文献15/23</w:t>
+            </w:r>
+          </w:p>
+        </w:tc>
+      </w:tr>
+    </w:tbl>
+    <w:p>
+      <w:pPr>
+        <w:jc w:val="both"/>
+        <w:spacing w:before="0" w:after="60"/>
+      </w:pPr>
+    </w:p>
+    <w:p>
+      <w:pPr>
+        <w:jc w:val="left"/>
+        <w:spacing w:before="200" w:after="80"/>
+      </w:pPr>
+      <w:r>
+        <w:rPr>
+          <w:b/>
+          <w:bCs/>
+          <w:sz w:val="26"/>
+          <w:szCs w:val="26"/>
+          <w:color w:val="2E75B6"/>
+          <w:rFonts w:hint="eastAsia" w:eastAsia="宋体" w:ascii="Times New Roman" w:hAnsi="Times New Roman"/>
+        </w:rPr>
+        <w:t xml:space="preserve">6.2  拓扑切换软开关（SOP）辅助运行——文献6</w:t>
+      </w:r>
+    </w:p>
+    <w:p>
+      <w:pPr>
+        <w:jc w:val="both"/>
+        <w:spacing w:before="0" w:after="60"/>
+        <w:ind w:left="0" w:firstLine="420"/>
+      </w:pPr>
+      <w:r>
+        <w:rPr>
+          <w:sz w:val="20"/>
+          <w:szCs w:val="20"/>
+          <w:rFonts w:hint="eastAsia" w:eastAsia="宋体" w:ascii="Times New Roman" w:hAnsi="Times New Roman"/>
+        </w:rPr>
+        <w:t xml:space="preserve">软开关（Soft Open Point, SOP）是基于背靠背变流器的电力电子装置，能在不切断电路的前提下实现拓扑柔性切换，故障时将受影响区域无缝转接至健康馈线。文献6（Wang et al., Modern Power Systems 2024）提出SOP辅助ADN实时协同运行方法，在拓扑切换后维持全网电压合格。</w:t>
+      </w:r>
+    </w:p>
+    <w:p>
+      <w:pPr>
+        <w:jc w:val="both"/>
+        <w:spacing w:before="0" w:after="60"/>
+        <w:ind w:left="0" w:firstLine="420"/>
+      </w:pPr>
+      <w:r>
+        <w:rPr>
+          <w:sz w:val="20"/>
+          <w:szCs w:val="20"/>
+          <w:rFonts w:hint="eastAsia" w:eastAsia="宋体" w:ascii="Times New Roman" w:hAnsi="Times New Roman"/>
+        </w:rPr>
+        <w:t xml:space="preserve">SOP功率平衡约束（节点i与节点j间）：</w:t>
+      </w:r>
+    </w:p>
+    <w:tbl>
+      <w:tblPr>
+        <w:tblStyle w:val="TableNormal"/>
+        <w:tblW w:w="9072" w:type="dxa"/>
+        <w:tblBorders>
+          <w:top w:val="none"/>
+          <w:left w:val="none"/>
+          <w:bottom w:val="none"/>
+          <w:right w:val="none"/>
+          <w:insideH w:val="none"/>
+          <w:insideV w:val="none"/>
+        </w:tblBorders>
+      </w:tblPr>
+      <w:tr>
+        <w:tc>
+          <w:tcPr>
+            <w:tcW w:w="7439" w:type="dxa"/>
+            <w:tcBorders>
+              <w:top w:val="none"/>
+              <w:bottom w:val="none"/>
+              <w:left w:val="none"/>
+              <w:right w:val="none"/>
+            </w:tcBorders>
+          </w:tcPr>
+          <w:p>
+            <w:pPr>
+              <w:jc w:val="center"/>
+            </w:pPr>
+            <m:oMath>
+              <m:sSub>
+                <m:sSubPr/>
+                <m:e>
+                  <m:r>
+                    <m:t>P</m:t>
+                  </m:r>
+                </m:e>
+                <m:sub>
+                  <m:r>
+                    <m:t>SOP,ij</m:t>
+                  </m:r>
+                </m:sub>
+              </m:sSub>
+              <m:r>
+                <m:t> + </m:t>
+              </m:r>
+              <m:sSub>
+                <m:sSubPr/>
+                <m:e>
+                  <m:r>
+                    <m:t>P</m:t>
+                  </m:r>
+                </m:e>
+                <m:sub>
+                  <m:r>
+                    <m:t>SOP,ji</m:t>
+                  </m:r>
+                </m:sub>
+              </m:sSub>
+              <m:r>
+                <m:t> + </m:t>
+              </m:r>
+              <m:sSub>
+                <m:sSubPr/>
+                <m:e>
+                  <m:r>
+                    <m:t>P</m:t>
+                  </m:r>
+                </m:e>
+                <m:sub>
+                  <m:r>
+                    <m:t>loss,SOP</m:t>
+                  </m:r>
+                </m:sub>
+              </m:sSub>
+              <m:r>
+                <m:t> = 0</m:t>
+              </m:r>
+            </m:oMath>
+          </w:p>
+        </w:tc>
+        <w:tc>
+          <w:tcPr>
+            <w:tcW w:w="1633" w:type="dxa"/>
+            <w:tcBorders>
+              <w:top w:val="none"/>
+              <w:bottom w:val="none"/>
+              <w:left w:val="none"/>
+              <w:right w:val="none"/>
+            </w:tcBorders>
+          </w:tcPr>
+          <w:p>
+            <w:pPr>
+              <w:jc w:val="right"/>
+            </w:pPr>
+            <w:r>
+              <w:rPr>
+                <w:sz w:val="20"/>
+                <w:szCs w:val="20"/>
+                <w:rFonts w:hint="eastAsia" w:eastAsia="宋体" w:ascii="Times New Roman" w:hAnsi="Times New Roman"/>
+              </w:rPr>
+              <w:t xml:space="preserve">(F1)</w:t>
+            </w:r>
+          </w:p>
+        </w:tc>
+      </w:tr>
+    </w:tbl>
+    <w:p>
+      <w:pPr>
+        <w:jc w:val="both"/>
+        <w:spacing w:before="0" w:after="60"/>
+        <w:ind w:left="0" w:firstLine="420"/>
+      </w:pPr>
+      <w:r>
+        <w:rPr>
+          <w:sz w:val="20"/>
+          <w:szCs w:val="20"/>
+          <w:rFonts w:hint="eastAsia" w:eastAsia="宋体" w:ascii="Times New Roman" w:hAnsi="Times New Roman"/>
+        </w:rPr>
+        <w:t xml:space="preserve">式中：P_SOP,ij 和 P_SOP,ji 为SOP两侧注入节点i、j的有功功率；P_loss,SOP 为变流器内部损耗，通常建模为二次损耗 a*P_SOP,ij^2 + b。</w:t>
+      </w:r>
+    </w:p>
+    <w:p>
+      <w:pPr>
+        <w:jc w:val="both"/>
+        <w:spacing w:before="0" w:after="60"/>
+        <w:ind w:left="0" w:firstLine="420"/>
+      </w:pPr>
+      <w:r>
+        <w:rPr>
+          <w:sz w:val="20"/>
+          <w:szCs w:val="20"/>
+          <w:rFonts w:hint="eastAsia" w:eastAsia="宋体" w:ascii="Times New Roman" w:hAnsi="Times New Roman"/>
+        </w:rPr>
+        <w:t xml:space="preserve">SOP视在功率容量约束（功率圆约束）：</w:t>
+      </w:r>
+    </w:p>
+    <w:tbl>
+      <w:tblPr>
+        <w:tblStyle w:val="TableNormal"/>
+        <w:tblW w:w="9072" w:type="dxa"/>
+        <w:tblBorders>
+          <w:top w:val="none"/>
+          <w:left w:val="none"/>
+          <w:bottom w:val="none"/>
+          <w:right w:val="none"/>
+          <w:insideH w:val="none"/>
+          <w:insideV w:val="none"/>
+        </w:tblBorders>
+      </w:tblPr>
+      <w:tr>
+        <w:tc>
+          <w:tcPr>
+            <w:tcW w:w="7439" w:type="dxa"/>
+            <w:tcBorders>
+              <w:top w:val="none"/>
+              <w:bottom w:val="none"/>
+              <w:left w:val="none"/>
+              <w:right w:val="none"/>
+            </w:tcBorders>
+          </w:tcPr>
+          <w:p>
+            <w:pPr>
+              <w:jc w:val="center"/>
+            </w:pPr>
+            <m:oMath>
+              <m:sSup>
+                <m:sSupPr/>
+                <m:e>
+                  <m:sSub>
+                    <m:sSubPr/>
+                    <m:e>
+                      <m:r>
+                        <m:t>P</m:t>
+                      </m:r>
+                    </m:e>
+                    <m:sub>
+                      <m:r>
+                        <m:t>SOP,ij</m:t>
+                      </m:r>
+                    </m:sub>
+                  </m:sSub>
+                </m:e>
+                <m:sup>
+                  <m:r>
+                    <m:t>2</m:t>
+                  </m:r>
+                </m:sup>
+              </m:sSup>
+              <m:r>
+                <m:t> + </m:t>
+              </m:r>
+              <m:sSup>
+                <m:sSupPr/>
+                <m:e>
+                  <m:sSub>
+                    <m:sSubPr/>
+                    <m:e>
+                      <m:r>
+                        <m:t>Q</m:t>
+                      </m:r>
+                    </m:e>
+                    <m:sub>
+                      <m:r>
+                        <m:t>SOP,i</m:t>
+                      </m:r>
+                    </m:sub>
+                  </m:sSub>
+                </m:e>
+                <m:sup>
+                  <m:r>
+                    <m:t>2</m:t>
+                  </m:r>
+                </m:sup>
+              </m:sSup>
+              <m:r>
+                <m:t> &lt;= </m:t>
+              </m:r>
+              <m:sSup>
+                <m:sSupPr/>
+                <m:e>
+                  <m:sSub>
+                    <m:sSubPr/>
+                    <m:e>
+                      <m:r>
+                        <m:t>S</m:t>
+                      </m:r>
+                    </m:e>
+                    <m:sub>
+                      <m:r>
+                        <m:t>SOP,max</m:t>
+                      </m:r>
+                    </m:sub>
+                  </m:sSub>
+                </m:e>
+                <m:sup>
+                  <m:r>
+                    <m:t>2</m:t>
+                  </m:r>
+                </m:sup>
+              </m:sSup>
+            </m:oMath>
+          </w:p>
+        </w:tc>
+        <w:tc>
+          <w:tcPr>
+            <w:tcW w:w="1633" w:type="dxa"/>
+            <w:tcBorders>
+              <w:top w:val="none"/>
+              <w:bottom w:val="none"/>
+              <w:left w:val="none"/>
+              <w:right w:val="none"/>
+            </w:tcBorders>
+          </w:tcPr>
+          <w:p>
+            <w:pPr>
+              <w:jc w:val="right"/>
+            </w:pPr>
+            <w:r>
+              <w:rPr>
+                <w:sz w:val="20"/>
+                <w:szCs w:val="20"/>
+                <w:rFonts w:hint="eastAsia" w:eastAsia="宋体" w:ascii="Times New Roman" w:hAnsi="Times New Roman"/>
+              </w:rPr>
+              <w:t xml:space="preserve">(F2)</w:t>
+            </w:r>
+          </w:p>
+        </w:tc>
+      </w:tr>
+    </w:tbl>
+    <w:p>
+      <w:pPr>
+        <w:jc w:val="both"/>
+        <w:spacing w:before="0" w:after="60"/>
+        <w:ind w:left="0" w:firstLine="420"/>
+      </w:pPr>
+      <w:r>
+        <w:rPr>
+          <w:sz w:val="20"/>
+          <w:szCs w:val="20"/>
+          <w:rFonts w:hint="eastAsia" w:eastAsia="宋体" w:ascii="Times New Roman" w:hAnsi="Times New Roman"/>
+        </w:rPr>
+        <w:t xml:space="preserve">SOP可独立控制两侧无功功率（Q_SOP,i 和 Q_SOP,j 各自独立调节），为故障后电压支撑提供额外自由度。故障k发生后新拓扑T^(k)下的电压灵敏度矩阵：</w:t>
+      </w:r>
+    </w:p>
+    <w:tbl>
+      <w:tblPr>
+        <w:tblStyle w:val="TableNormal"/>
+        <w:tblW w:w="9072" w:type="dxa"/>
+        <w:tblBorders>
+          <w:top w:val="none"/>
+          <w:left w:val="none"/>
+          <w:bottom w:val="none"/>
+          <w:right w:val="none"/>
+          <w:insideH w:val="none"/>
+          <w:insideV w:val="none"/>
+        </w:tblBorders>
+      </w:tblPr>
+      <w:tr>
+        <w:tc>
+          <w:tcPr>
+            <w:tcW w:w="7439" w:type="dxa"/>
+            <w:tcBorders>
+              <w:top w:val="none"/>
+              <w:bottom w:val="none"/>
+              <w:left w:val="none"/>
+              <w:right w:val="none"/>
+            </w:tcBorders>
+          </w:tcPr>
+          <w:p>
+            <w:pPr>
+              <w:jc w:val="center"/>
+            </w:pPr>
+            <m:oMath>
+              <m:sSup>
+                <m:sSupPr/>
+                <m:e>
+                  <m:r>
+                    <m:t>S</m:t>
+                  </m:r>
+                </m:e>
+                <m:sup>
+                  <m:r>
+                    <m:t>(k)</m:t>
+                  </m:r>
+                </m:sup>
+              </m:sSup>
+              <m:r>
+                <m:t> = LinDistFlow(T</m:t>
+              </m:r>
+              <m:sSup>
+                <m:sSupPr/>
+                <m:e>
+                  <m:r>
+                    <m:t/>
+                  </m:r>
+                </m:e>
+                <m:sup>
+                  <m:r>
+                    <m:t>(k)</m:t>
+                  </m:r>
+                </m:sup>
+              </m:sSup>
+              <m:r>
+                <m:t>)</m:t>
+              </m:r>
+            </m:oMath>
+          </w:p>
+        </w:tc>
+        <w:tc>
+          <w:tcPr>
+            <w:tcW w:w="1633" w:type="dxa"/>
+            <w:tcBorders>
+              <w:top w:val="none"/>
+              <w:bottom w:val="none"/>
+              <w:left w:val="none"/>
+              <w:right w:val="none"/>
+            </w:tcBorders>
+          </w:tcPr>
+          <w:p>
+            <w:pPr>
+              <w:jc w:val="right"/>
+            </w:pPr>
+            <w:r>
+              <w:rPr>
+                <w:sz w:val="20"/>
+                <w:szCs w:val="20"/>
+                <w:rFonts w:hint="eastAsia" w:eastAsia="宋体" w:ascii="Times New Roman" w:hAnsi="Times New Roman"/>
+              </w:rPr>
+              <w:t xml:space="preserve">(F3)</w:t>
+            </w:r>
+          </w:p>
+        </w:tc>
+      </w:tr>
+    </w:tbl>
+    <w:p>
+      <w:pPr>
+        <w:jc w:val="both"/>
+        <w:spacing w:before="0" w:after="60"/>
+        <w:ind w:left="0" w:firstLine="420"/>
+      </w:pPr>
+      <w:r>
+        <w:rPr>
+          <w:sz w:val="20"/>
+          <w:szCs w:val="20"/>
+          <w:rFonts w:hint="eastAsia" w:eastAsia="宋体" w:ascii="Times New Roman" w:hAnsi="Times New Roman"/>
+        </w:rPr>
+        <w:t xml:space="preserve">在SOP柔性互联下，T^(k)是重构后的联通拓扑而非孤岛拓扑，可直接用LinDistFlow计算新S^(k)，为后续灵敏度重辨识（6.6节）提供解析初始值，实现故障后快速无缝切换。</w:t>
+      </w:r>
+    </w:p>
+    <w:p>
+      <w:pPr>
+        <w:jc w:val="both"/>
+        <w:spacing w:before="0" w:after="60"/>
+      </w:pPr>
+    </w:p>
+    <w:p>
+      <w:pPr>
+        <w:jc w:val="left"/>
+        <w:spacing w:before="200" w:after="80"/>
+      </w:pPr>
+      <w:r>
+        <w:rPr>
+          <w:b/>
+          <w:bCs/>
+          <w:sz w:val="26"/>
+          <w:szCs w:val="26"/>
+          <w:color w:val="2E75B6"/>
+          <w:rFonts w:hint="eastAsia" w:eastAsia="宋体" w:ascii="Times New Roman" w:hAnsi="Times New Roman"/>
+        </w:rPr>
+        <w:t xml:space="preserve">6.3  故障诱发延迟电压恢复（FIDVR）抑制——文献15</w:t>
+      </w:r>
+    </w:p>
+    <w:p>
+      <w:pPr>
+        <w:jc w:val="both"/>
+        <w:spacing w:before="0" w:after="60"/>
+        <w:ind w:left="0" w:firstLine="420"/>
+      </w:pPr>
+      <w:r>
+        <w:rPr>
+          <w:sz w:val="20"/>
+          <w:szCs w:val="20"/>
+          <w:rFonts w:hint="eastAsia" w:eastAsia="宋体" w:ascii="Times New Roman" w:hAnsi="Times New Roman"/>
+        </w:rPr>
+        <w:t xml:space="preserve">FIDVR（Fault-Induced Delayed Voltage Recovery，故障诱发延迟电压恢复）是配电网典型故障后电压失稳模式：大量感应电动机在低电压期间堵转，故障切除后吸收大量无功功率，导致电压长时间无法恢复至正常范围。文献15（Park et al., IEEE TPS 2021）利用储能系统（ESS）配合信号时序逻辑（STL）控制律进行FIDVR抑制。</w:t>
+      </w:r>
+    </w:p>
+    <w:p>
+      <w:pPr>
+        <w:jc w:val="both"/>
+        <w:spacing w:before="0" w:after="60"/>
+        <w:ind w:left="0" w:firstLine="420"/>
+      </w:pPr>
+      <w:r>
+        <w:rPr>
+          <w:sz w:val="20"/>
+          <w:szCs w:val="20"/>
+          <w:rFonts w:hint="eastAsia" w:eastAsia="宋体" w:ascii="Times New Roman" w:hAnsi="Times New Roman"/>
+        </w:rPr>
+        <w:t xml:space="preserve">FIDVR检测条件——联合电压幅值与变化率判断：</w:t>
+      </w:r>
+    </w:p>
+    <w:tbl>
+      <w:tblPr>
+        <w:tblStyle w:val="TableNormal"/>
+        <w:tblW w:w="9072" w:type="dxa"/>
+        <w:tblBorders>
+          <w:top w:val="none"/>
+          <w:left w:val="none"/>
+          <w:bottom w:val="none"/>
+          <w:right w:val="none"/>
+          <w:insideH w:val="none"/>
+          <w:insideV w:val="none"/>
+        </w:tblBorders>
+      </w:tblPr>
+      <w:tr>
+        <w:tc>
+          <w:tcPr>
+            <w:tcW w:w="7439" w:type="dxa"/>
+            <w:tcBorders>
+              <w:top w:val="none"/>
+              <w:bottom w:val="none"/>
+              <w:left w:val="none"/>
+              <w:right w:val="none"/>
+            </w:tcBorders>
+          </w:tcPr>
+          <w:p>
+            <w:pPr>
+              <w:jc w:val="center"/>
+            </w:pPr>
+            <m:oMath>
+              <m:sSub>
+                <m:sSubPr/>
+                <m:e>
+                  <m:r>
+                    <m:t>Phi</m:t>
+                  </m:r>
+                </m:e>
+                <m:sub>
+                  <m:r>
+                    <m:t>FIDVR</m:t>
+                  </m:r>
+                </m:sub>
+              </m:sSub>
+              <m:r>
+                <m:t>(t) = 1{V(t) &lt; </m:t>
+              </m:r>
+              <m:sSub>
+                <m:sSubPr/>
+                <m:e>
+                  <m:r>
+                    <m:t>V</m:t>
+                  </m:r>
+                </m:e>
+                <m:sub>
+                  <m:r>
+                    <m:t>th</m:t>
+                  </m:r>
+                </m:sub>
+              </m:sSub>
+              <m:r>
+                <m:t>} AND 1{dV/dt &lt; 0}</m:t>
+              </m:r>
+            </m:oMath>
+          </w:p>
+        </w:tc>
+        <w:tc>
+          <w:tcPr>
+            <w:tcW w:w="1633" w:type="dxa"/>
+            <w:tcBorders>
+              <w:top w:val="none"/>
+              <w:bottom w:val="none"/>
+              <w:left w:val="none"/>
+              <w:right w:val="none"/>
+            </w:tcBorders>
+          </w:tcPr>
+          <w:p>
+            <w:pPr>
+              <w:jc w:val="right"/>
+            </w:pPr>
+            <w:r>
+              <w:rPr>
+                <w:sz w:val="20"/>
+                <w:szCs w:val="20"/>
+                <w:rFonts w:hint="eastAsia" w:eastAsia="宋体" w:ascii="Times New Roman" w:hAnsi="Times New Roman"/>
+              </w:rPr>
+              <w:t xml:space="preserve">(F4)</w:t>
+            </w:r>
+          </w:p>
+        </w:tc>
+      </w:tr>
+    </w:tbl>
+    <w:p>
+      <w:pPr>
+        <w:jc w:val="both"/>
+        <w:spacing w:before="0" w:after="60"/>
+        <w:ind w:left="0" w:firstLine="420"/>
+      </w:pPr>
+      <w:r>
+        <w:rPr>
+          <w:sz w:val="20"/>
+          <w:szCs w:val="20"/>
+          <w:rFonts w:hint="eastAsia" w:eastAsia="宋体" w:ascii="Times New Roman" w:hAnsi="Times New Roman"/>
+        </w:rPr>
+        <w:t xml:space="preserve">式中：V_th 为FIDVR检测阈值，一般取0.85~0.90 p.u.；当电压低于阈值且持续下降时触发FIDVR控制模式，即进入事中阶段储能紧急响应。</w:t>
+      </w:r>
+    </w:p>
+    <w:p>
+      <w:pPr>
+        <w:jc w:val="both"/>
+        <w:spacing w:before="0" w:after="60"/>
+        <w:ind w:left="0" w:firstLine="420"/>
+      </w:pPr>
+      <w:r>
+        <w:rPr>
+          <w:sz w:val="20"/>
+          <w:szCs w:val="20"/>
+          <w:rFonts w:hint="eastAsia" w:eastAsia="宋体" w:ascii="Times New Roman" w:hAnsi="Times New Roman"/>
+        </w:rPr>
+        <w:t xml:space="preserve">STL满足度（robustness metric）——连续可微的电压恢复质量指标：</w:t>
+      </w:r>
+    </w:p>
+    <w:tbl>
+      <w:tblPr>
+        <w:tblStyle w:val="TableNormal"/>
+        <w:tblW w:w="9072" w:type="dxa"/>
+        <w:tblBorders>
+          <w:top w:val="none"/>
+          <w:left w:val="none"/>
+          <w:bottom w:val="none"/>
+          <w:right w:val="none"/>
+          <w:insideH w:val="none"/>
+          <w:insideV w:val="none"/>
+        </w:tblBorders>
+      </w:tblPr>
+      <w:tr>
+        <w:tc>
+          <w:tcPr>
+            <w:tcW w:w="7439" w:type="dxa"/>
+            <w:tcBorders>
+              <w:top w:val="none"/>
+              <w:bottom w:val="none"/>
+              <w:left w:val="none"/>
+              <w:right w:val="none"/>
+            </w:tcBorders>
+          </w:tcPr>
+          <w:p>
+            <w:pPr>
+              <w:jc w:val="center"/>
+            </w:pPr>
+            <m:oMath>
+              <m:sSup>
+                <m:sSupPr/>
+                <m:e>
+                  <m:r>
+                    <m:t>rho</m:t>
+                  </m:r>
+                </m:e>
+                <m:sup>
+                  <m:r>
+                    <m:t>phi</m:t>
+                  </m:r>
+                </m:sup>
+              </m:sSup>
+              <m:r>
+                <m:t>(t) = </m:t>
+              </m:r>
+              <m:sSub>
+                <m:sSubPr/>
+                <m:e>
+                  <m:r>
+                    <m:t>min</m:t>
+                  </m:r>
+                </m:e>
+                <m:sub>
+                  <m:r>
+                    <m:t>s in [t, t+T_rec]</m:t>
+                  </m:r>
+                </m:sub>
+              </m:sSub>
+              <m:r>
+                <m:t>(V(s) - </m:t>
+              </m:r>
+              <m:sSub>
+                <m:sSubPr/>
+                <m:e>
+                  <m:r>
+                    <m:t>V</m:t>
+                  </m:r>
+                </m:e>
+                <m:sub>
+                  <m:r>
+                    <m:t>min</m:t>
+                  </m:r>
+                </m:sub>
+              </m:sSub>
+              <m:r>
+                <m:t>)</m:t>
+              </m:r>
+            </m:oMath>
+          </w:p>
+        </w:tc>
+        <w:tc>
+          <w:tcPr>
+            <w:tcW w:w="1633" w:type="dxa"/>
+            <w:tcBorders>
+              <w:top w:val="none"/>
+              <w:bottom w:val="none"/>
+              <w:left w:val="none"/>
+              <w:right w:val="none"/>
+            </w:tcBorders>
+          </w:tcPr>
+          <w:p>
+            <w:pPr>
+              <w:jc w:val="right"/>
+            </w:pPr>
+            <w:r>
+              <w:rPr>
+                <w:sz w:val="20"/>
+                <w:szCs w:val="20"/>
+                <w:rFonts w:hint="eastAsia" w:eastAsia="宋体" w:ascii="Times New Roman" w:hAnsi="Times New Roman"/>
+              </w:rPr>
+              <w:t xml:space="preserve">(F5)</w:t>
+            </w:r>
+          </w:p>
+        </w:tc>
+      </w:tr>
+    </w:tbl>
+    <w:p>
+      <w:pPr>
+        <w:jc w:val="both"/>
+        <w:spacing w:before="0" w:after="60"/>
+        <w:ind w:left="0" w:firstLine="420"/>
+      </w:pPr>
+      <w:r>
+        <w:rPr>
+          <w:sz w:val="20"/>
+          <w:szCs w:val="20"/>
+          <w:rFonts w:hint="eastAsia" w:eastAsia="宋体" w:ascii="Times New Roman" w:hAnsi="Times New Roman"/>
+        </w:rPr>
+        <w:t xml:space="preserve">式中：T_rec 为规定的最大电压恢复时间（典型值2~5 s）；rho^phi(t)&gt;0 表示STL约束满足，值越大恢复裕度越充足。相比硬约束，STL满足度提供连续可微的优化指标，便于与三阶段框架的LP目标函数集成。</w:t>
+      </w:r>
+    </w:p>
+    <w:p>
+      <w:pPr>
+        <w:jc w:val="both"/>
+        <w:spacing w:before="0" w:after="60"/>
+        <w:ind w:left="0" w:firstLine="420"/>
+      </w:pPr>
+      <w:r>
+        <w:rPr>
+          <w:sz w:val="20"/>
+          <w:szCs w:val="20"/>
+          <w:rFonts w:hint="eastAsia" w:eastAsia="宋体" w:ascii="Times New Roman" w:hAnsi="Times New Roman"/>
+        </w:rPr>
+        <w:t xml:space="preserve">ESS紧急控制律（最大化STL满足度，同时约束SOC偏差）：</w:t>
+      </w:r>
+    </w:p>
+    <w:tbl>
+      <w:tblPr>
+        <w:tblStyle w:val="TableNormal"/>
+        <w:tblW w:w="9072" w:type="dxa"/>
+        <w:tblBorders>
+          <w:top w:val="none"/>
+          <w:left w:val="none"/>
+          <w:bottom w:val="none"/>
+          <w:right w:val="none"/>
+          <w:insideH w:val="none"/>
+          <w:insideV w:val="none"/>
+        </w:tblBorders>
+      </w:tblPr>
+      <w:tr>
+        <w:tc>
+          <w:tcPr>
+            <w:tcW w:w="7439" w:type="dxa"/>
+            <w:tcBorders>
+              <w:top w:val="none"/>
+              <w:bottom w:val="none"/>
+              <w:left w:val="none"/>
+              <w:right w:val="none"/>
+            </w:tcBorders>
+          </w:tcPr>
+          <w:p>
+            <w:pPr>
+              <w:jc w:val="center"/>
+            </w:pPr>
+            <m:oMath>
+              <m:sSup>
+                <m:sSupPr/>
+                <m:e>
+                  <m:r>
+                    <m:t>P</m:t>
+                  </m:r>
+                </m:e>
+                <m:sup>
+                  <m:r>
+                    <m:t>*</m:t>
+                  </m:r>
+                </m:sup>
+              </m:sSup>
+              <m:sSub>
+                <m:sSubPr/>
+                <m:e>
+                  <m:r>
+                    <m:t>ESS</m:t>
+                  </m:r>
+                </m:e>
+                <m:sub>
+                  <m:r>
+                    <m:t/>
+                  </m:r>
+                </m:sub>
+              </m:sSub>
+              <m:r>
+                <m:t>(t) = argmin</m:t>
+              </m:r>
+              <m:sSub>
+                <m:sSubPr/>
+                <m:e>
+                  <m:r>
+                    <m:t/>
+                  </m:r>
+                </m:e>
+                <m:sub>
+                  <m:r>
+                    <m:t>P in [P_min,P_max]</m:t>
+                  </m:r>
+                </m:sub>
+              </m:sSub>
+              <m:r>
+                <m:t>{-rho^phi(t) + lambda_E * (E(t) - </m:t>
+              </m:r>
+              <m:sSub>
+                <m:sSubPr/>
+                <m:e>
+                  <m:r>
+                    <m:t>E</m:t>
+                  </m:r>
+                </m:e>
+                <m:sub>
+                  <m:r>
+                    <m:t>ref</m:t>
+                  </m:r>
+                </m:sub>
+              </m:sSub>
+              <m:r>
+                <m:t>)^2}</m:t>
+              </m:r>
+            </m:oMath>
+          </w:p>
+        </w:tc>
+        <w:tc>
+          <w:tcPr>
+            <w:tcW w:w="1633" w:type="dxa"/>
+            <w:tcBorders>
+              <w:top w:val="none"/>
+              <w:bottom w:val="none"/>
+              <w:left w:val="none"/>
+              <w:right w:val="none"/>
+            </w:tcBorders>
+          </w:tcPr>
+          <w:p>
+            <w:pPr>
+              <w:jc w:val="right"/>
+            </w:pPr>
+            <w:r>
+              <w:rPr>
+                <w:sz w:val="20"/>
+                <w:szCs w:val="20"/>
+                <w:rFonts w:hint="eastAsia" w:eastAsia="宋体" w:ascii="Times New Roman" w:hAnsi="Times New Roman"/>
+              </w:rPr>
+              <w:t xml:space="preserve">(F6)</w:t>
+            </w:r>
+          </w:p>
+        </w:tc>
+      </w:tr>
+    </w:tbl>
+    <w:p>
+      <w:pPr>
+        <w:jc w:val="both"/>
+        <w:spacing w:before="0" w:after="60"/>
+        <w:ind w:left="0" w:firstLine="420"/>
+      </w:pPr>
+      <w:r>
+        <w:rPr>
+          <w:sz w:val="20"/>
+          <w:szCs w:val="20"/>
+          <w:rFonts w:hint="eastAsia" w:eastAsia="宋体" w:ascii="Times New Roman" w:hAnsi="Times New Roman"/>
+        </w:rPr>
+        <w:t xml:space="preserve">式中：lambda_E 为SOC偏差权重系数，平衡FIDVR抑制与储能能量管理；控制律保证在最大T_rec内将电压恢复至V_min以上，与三阶段框架事中阶段储能快速响应（文献4的LSF驱动调度）在执行层直接对接。</w:t>
+      </w:r>
+    </w:p>
+    <w:p>
+      <w:pPr>
+        <w:jc w:val="both"/>
+        <w:spacing w:before="0" w:after="60"/>
+      </w:pPr>
+    </w:p>
+    <w:p>
+      <w:pPr>
+        <w:jc w:val="left"/>
+        <w:spacing w:before="200" w:after="80"/>
+      </w:pPr>
+      <w:r>
+        <w:rPr>
+          <w:b/>
+          <w:bCs/>
+          <w:sz w:val="26"/>
+          <w:szCs w:val="26"/>
+          <w:color w:val="2E75B6"/>
+          <w:rFonts w:hint="eastAsia" w:eastAsia="宋体" w:ascii="Times New Roman" w:hAnsi="Times New Roman"/>
+        </w:rPr>
+        <w:t xml:space="preserve">6.4  PV逆变器短时电压稳定控制——文献23</w:t>
+      </w:r>
+    </w:p>
+    <w:p>
+      <w:pPr>
+        <w:jc w:val="both"/>
+        <w:spacing w:before="0" w:after="60"/>
+        <w:ind w:left="0" w:firstLine="420"/>
+      </w:pPr>
+      <w:r>
+        <w:rPr>
+          <w:sz w:val="20"/>
+          <w:szCs w:val="20"/>
+          <w:rFonts w:hint="eastAsia" w:eastAsia="宋体" w:ascii="Times New Roman" w:hAnsi="Times New Roman"/>
+        </w:rPr>
+        <w:t xml:space="preserve">文献23（Lammert et al., IEEE TEC 2019）研究PV逆变器对故障后短时电压稳定的贡献机理及控制策略。故障期间PV须满足低电压穿越（LVRT, Low Voltage Ride-Through）要求，通过注入无功电流支撑电压恢复。</w:t>
+      </w:r>
+    </w:p>
+    <w:p>
+      <w:pPr>
+        <w:jc w:val="both"/>
+        <w:spacing w:before="0" w:after="60"/>
+        <w:ind w:left="0" w:firstLine="420"/>
+      </w:pPr>
+      <w:r>
+        <w:rPr>
+          <w:sz w:val="20"/>
+          <w:szCs w:val="20"/>
+          <w:rFonts w:hint="eastAsia" w:eastAsia="宋体" w:ascii="Times New Roman" w:hAnsi="Times New Roman"/>
+        </w:rPr>
+        <w:t xml:space="preserve">LVRT无功电流注入标准（德国VDE-AR-N 4120 / 中国GB/T 19964）：</w:t>
+      </w:r>
+    </w:p>
+    <w:tbl>
+      <w:tblPr>
+        <w:tblStyle w:val="TableNormal"/>
+        <w:tblW w:w="9072" w:type="dxa"/>
+        <w:tblBorders>
+          <w:top w:val="none"/>
+          <w:left w:val="none"/>
+          <w:bottom w:val="none"/>
+          <w:right w:val="none"/>
+          <w:insideH w:val="none"/>
+          <w:insideV w:val="none"/>
+        </w:tblBorders>
+      </w:tblPr>
+      <w:tr>
+        <w:tc>
+          <w:tcPr>
+            <w:tcW w:w="7439" w:type="dxa"/>
+            <w:tcBorders>
+              <w:top w:val="none"/>
+              <w:bottom w:val="none"/>
+              <w:left w:val="none"/>
+              <w:right w:val="none"/>
+            </w:tcBorders>
+          </w:tcPr>
+          <w:p>
+            <w:pPr>
+              <w:jc w:val="center"/>
+            </w:pPr>
+            <m:oMath>
+              <m:sSub>
+                <m:sSubPr/>
+                <m:e>
+                  <m:r>
+                    <m:t>I</m:t>
+                  </m:r>
+                </m:e>
+                <m:sub>
+                  <m:r>
+                    <m:t>Q,PV</m:t>
+                  </m:r>
+                </m:sub>
+              </m:sSub>
+              <m:r>
+                <m:t>(t) = </m:t>
+              </m:r>
+              <m:sSub>
+                <m:sSubPr/>
+                <m:e>
+                  <m:r>
+                    <m:t>k</m:t>
+                  </m:r>
+                </m:e>
+                <m:sub>
+                  <m:r>
+                    <m:t>LVRT</m:t>
+                  </m:r>
+                </m:sub>
+              </m:sSub>
+              <m:r>
+                <m:t> * max(0, 1 - V(t)/</m:t>
+              </m:r>
+              <m:sSub>
+                <m:sSubPr/>
+                <m:e>
+                  <m:r>
+                    <m:t>V</m:t>
+                  </m:r>
+                </m:e>
+                <m:sub>
+                  <m:r>
+                    <m:t>n</m:t>
+                  </m:r>
+                </m:sub>
+              </m:sSub>
+              <m:r>
+                <m:t>) * </m:t>
+              </m:r>
+              <m:sSub>
+                <m:sSubPr/>
+                <m:e>
+                  <m:r>
+                    <m:t>I</m:t>
+                  </m:r>
+                </m:e>
+                <m:sub>
+                  <m:r>
+                    <m:t>n</m:t>
+                  </m:r>
+                </m:sub>
+              </m:sSub>
+            </m:oMath>
+          </w:p>
+        </w:tc>
+        <w:tc>
+          <w:tcPr>
+            <w:tcW w:w="1633" w:type="dxa"/>
+            <w:tcBorders>
+              <w:top w:val="none"/>
+              <w:bottom w:val="none"/>
+              <w:left w:val="none"/>
+              <w:right w:val="none"/>
+            </w:tcBorders>
+          </w:tcPr>
+          <w:p>
+            <w:pPr>
+              <w:jc w:val="right"/>
+            </w:pPr>
+            <w:r>
+              <w:rPr>
+                <w:sz w:val="20"/>
+                <w:szCs w:val="20"/>
+                <w:rFonts w:hint="eastAsia" w:eastAsia="宋体" w:ascii="Times New Roman" w:hAnsi="Times New Roman"/>
+              </w:rPr>
+              <w:t xml:space="preserve">(F7)</w:t>
+            </w:r>
+          </w:p>
+        </w:tc>
+      </w:tr>
+    </w:tbl>
+    <w:p>
+      <w:pPr>
+        <w:jc w:val="both"/>
+        <w:spacing w:before="0" w:after="60"/>
+        <w:ind w:left="0" w:firstLine="420"/>
+      </w:pPr>
+      <w:r>
+        <w:rPr>
+          <w:sz w:val="20"/>
+          <w:szCs w:val="20"/>
+          <w:rFonts w:hint="eastAsia" w:eastAsia="宋体" w:ascii="Times New Roman" w:hAnsi="Times New Roman"/>
+        </w:rPr>
+        <w:t xml:space="preserve">式中：k_LVRT 为无功电流增益，标准要求k_LVRT &gt;= 2（电压每跌落10%额定值，注入10%额定无功电流）；V_n 为额定电压（1 p.u.）；I_n 为PV额定电流。</w:t>
+      </w:r>
+    </w:p>
+    <w:p>
+      <w:pPr>
+        <w:jc w:val="both"/>
+        <w:spacing w:before="0" w:after="60"/>
+        <w:ind w:left="0" w:firstLine="420"/>
+      </w:pPr>
+      <w:r>
+        <w:rPr>
+          <w:sz w:val="20"/>
+          <w:szCs w:val="20"/>
+          <w:rFonts w:hint="eastAsia" w:eastAsia="宋体" w:ascii="Times New Roman" w:hAnsi="Times New Roman"/>
+        </w:rPr>
+        <w:t xml:space="preserve">LVRT控制的短时电压恢复目标：</w:t>
+      </w:r>
+    </w:p>
+    <w:tbl>
+      <w:tblPr>
+        <w:tblStyle w:val="TableNormal"/>
+        <w:tblW w:w="9072" w:type="dxa"/>
+        <w:tblBorders>
+          <w:top w:val="none"/>
+          <w:left w:val="none"/>
+          <w:bottom w:val="none"/>
+          <w:right w:val="none"/>
+          <w:insideH w:val="none"/>
+          <w:insideV w:val="none"/>
+        </w:tblBorders>
+      </w:tblPr>
+      <w:tr>
+        <w:tc>
+          <w:tcPr>
+            <w:tcW w:w="7439" w:type="dxa"/>
+            <w:tcBorders>
+              <w:top w:val="none"/>
+              <w:bottom w:val="none"/>
+              <w:left w:val="none"/>
+              <w:right w:val="none"/>
+            </w:tcBorders>
+          </w:tcPr>
+          <w:p>
+            <w:pPr>
+              <w:jc w:val="center"/>
+            </w:pPr>
+            <m:oMath>
+              <m:r>
+                <m:t>lim</m:t>
+              </m:r>
+              <m:sSub>
+                <m:sSubPr/>
+                <m:e>
+                  <m:r>
+                    <m:t/>
+                  </m:r>
+                </m:e>
+                <m:sub>
+                  <m:r>
+                    <m:t>t -&gt; T_rec</m:t>
+                  </m:r>
+                </m:sub>
+              </m:sSub>
+              <m:r>
+                <m:t> V(t) &gt;= </m:t>
+              </m:r>
+              <m:sSub>
+                <m:sSubPr/>
+                <m:e>
+                  <m:r>
+                    <m:t>V</m:t>
+                  </m:r>
+                </m:e>
+                <m:sub>
+                  <m:r>
+                    <m:t>min</m:t>
+                  </m:r>
+                </m:sub>
+              </m:sSub>
+            </m:oMath>
+          </w:p>
+        </w:tc>
+        <w:tc>
+          <w:tcPr>
+            <w:tcW w:w="1633" w:type="dxa"/>
+            <w:tcBorders>
+              <w:top w:val="none"/>
+              <w:bottom w:val="none"/>
+              <w:left w:val="none"/>
+              <w:right w:val="none"/>
+            </w:tcBorders>
+          </w:tcPr>
+          <w:p>
+            <w:pPr>
+              <w:jc w:val="right"/>
+            </w:pPr>
+            <w:r>
+              <w:rPr>
+                <w:sz w:val="20"/>
+                <w:szCs w:val="20"/>
+                <w:rFonts w:hint="eastAsia" w:eastAsia="宋体" w:ascii="Times New Roman" w:hAnsi="Times New Roman"/>
+              </w:rPr>
+              <w:t xml:space="preserve">(F8)</w:t>
+            </w:r>
+          </w:p>
+        </w:tc>
+      </w:tr>
+    </w:tbl>
+    <w:p>
+      <w:pPr>
+        <w:jc w:val="both"/>
+        <w:spacing w:before="0" w:after="60"/>
+        <w:ind w:left="0" w:firstLine="420"/>
+      </w:pPr>
+      <w:r>
+        <w:rPr>
+          <w:sz w:val="20"/>
+          <w:szCs w:val="20"/>
+          <w:rFonts w:hint="eastAsia" w:eastAsia="宋体" w:ascii="Times New Roman" w:hAnsi="Times New Roman"/>
+        </w:rPr>
+        <w:t xml:space="preserve">文献23表明：适当增大k_LVRT（超出标准最低要求）能显著提升短时恢复速度，但过大时故障切除瞬间可能发生电压过冲，需与ESS紧急控制联合调优。与三阶段框架的关联：PV的LVRT行为改变故障期有功/无功注入特性，需在P-box不确定集中对故障工况单独建模，区别于正常运行的PV出力区间 [P_min(t), P_max(t)]。</w:t>
+      </w:r>
+    </w:p>
+    <w:p>
+      <w:pPr>
+        <w:jc w:val="both"/>
+        <w:spacing w:before="0" w:after="60"/>
+      </w:pPr>
+    </w:p>
+    <w:p>
+      <w:pPr>
+        <w:jc w:val="left"/>
+        <w:spacing w:before="200" w:after="80"/>
+      </w:pPr>
+      <w:r>
+        <w:rPr>
+          <w:b/>
+          <w:bCs/>
+          <w:sz w:val="26"/>
+          <w:szCs w:val="26"/>
+          <w:color w:val="2E75B6"/>
+          <w:rFonts w:hint="eastAsia" w:eastAsia="宋体" w:ascii="Times New Roman" w:hAnsi="Times New Roman"/>
+        </w:rPr>
+        <w:t xml:space="preserve">6.5  N-1安全约束嵌入预规划LP——文献3与文献20</w:t>
+      </w:r>
+    </w:p>
+    <w:p>
+      <w:pPr>
+        <w:jc w:val="both"/>
+        <w:spacing w:before="0" w:after="60"/>
+        <w:ind w:left="0" w:firstLine="420"/>
+      </w:pPr>
+      <w:r>
+        <w:rPr>
+          <w:sz w:val="20"/>
+          <w:szCs w:val="20"/>
+          <w:rFonts w:hint="eastAsia" w:eastAsia="宋体" w:ascii="Times New Roman" w:hAnsi="Times New Roman"/>
+        </w:rPr>
+        <w:t xml:space="preserve">为使预规划阶段的优化结果在N-1故障下安全可行，需在LP中引入预想故障集约束。设K_N1为N-1预想故障集（各支路单独开断），|K_N1|=|E|（支路总数）。</w:t>
+      </w:r>
+    </w:p>
+    <w:p>
+      <w:pPr>
+        <w:jc w:val="both"/>
+        <w:spacing w:before="0" w:after="60"/>
+        <w:ind w:left="0" w:firstLine="420"/>
+      </w:pPr>
+      <w:r>
+        <w:rPr>
+          <w:sz w:val="20"/>
+          <w:szCs w:val="20"/>
+          <w:rFonts w:hint="eastAsia" w:eastAsia="宋体" w:ascii="Times New Roman" w:hAnsi="Times New Roman"/>
+        </w:rPr>
+        <w:t xml:space="preserve">故障拓扑k下的节点电压约束（确定性N-1约束）：</w:t>
+      </w:r>
+    </w:p>
+    <w:tbl>
+      <w:tblPr>
+        <w:tblStyle w:val="TableNormal"/>
+        <w:tblW w:w="9072" w:type="dxa"/>
+        <w:tblBorders>
+          <w:top w:val="none"/>
+          <w:left w:val="none"/>
+          <w:bottom w:val="none"/>
+          <w:right w:val="none"/>
+          <w:insideH w:val="none"/>
+          <w:insideV w:val="none"/>
+        </w:tblBorders>
+      </w:tblPr>
+      <w:tr>
+        <w:tc>
+          <w:tcPr>
+            <w:tcW w:w="7439" w:type="dxa"/>
+            <w:tcBorders>
+              <w:top w:val="none"/>
+              <w:bottom w:val="none"/>
+              <w:left w:val="none"/>
+              <w:right w:val="none"/>
+            </w:tcBorders>
+          </w:tcPr>
+          <w:p>
+            <w:pPr>
+              <w:jc w:val="center"/>
+            </w:pPr>
+            <m:oMath>
+              <m:sSub>
+                <m:sSubPr/>
+                <m:e>
+                  <m:r>
+                    <m:t>V</m:t>
+                  </m:r>
+                </m:e>
+                <m:sub>
+                  <m:r>
+                    <m:t>min</m:t>
+                  </m:r>
+                </m:sub>
+              </m:sSub>
+              <m:r>
+                <m:t> &lt;= </m:t>
+              </m:r>
+              <m:sSub>
+                <m:sSubPr/>
+                <m:e>
+                  <m:r>
+                    <m:t>V</m:t>
+                  </m:r>
+                </m:e>
+                <m:sub>
+                  <m:r>
+                    <m:t>0</m:t>
+                  </m:r>
+                </m:sub>
+              </m:sSub>
+              <m:r>
+                <m:t> + S</m:t>
+              </m:r>
+              <m:sSup>
+                <m:sSupPr/>
+                <m:e>
+                  <m:r>
+                    <m:t/>
+                  </m:r>
+                </m:e>
+                <m:sup>
+                  <m:r>
+                    <m:t>(k)</m:t>
+                  </m:r>
+                </m:sup>
+              </m:sSup>
+              <m:r>
+                <m:t> * (</m:t>
+              </m:r>
+              <m:sSub>
+                <m:sSubPr/>
+                <m:e>
+                  <m:r>
+                    <m:t>P</m:t>
+                  </m:r>
+                </m:e>
+                <m:sub>
+                  <m:r>
+                    <m:t>net</m:t>
+                  </m:r>
+                </m:sub>
+              </m:sSub>
+              <m:r>
+                <m:t> - </m:t>
+              </m:r>
+              <m:sSub>
+                <m:sSubPr/>
+                <m:e>
+                  <m:r>
+                    <m:t>P</m:t>
+                  </m:r>
+                </m:e>
+                <m:sub>
+                  <m:r>
+                    <m:t>DER</m:t>
+                  </m:r>
+                </m:sub>
+              </m:sSub>
+              <m:r>
+                <m:t>) &lt;= </m:t>
+              </m:r>
+              <m:sSub>
+                <m:sSubPr/>
+                <m:e>
+                  <m:r>
+                    <m:t>V</m:t>
+                  </m:r>
+                </m:e>
+                <m:sub>
+                  <m:r>
+                    <m:t>max</m:t>
+                  </m:r>
+                </m:sub>
+              </m:sSub>
+              <m:r>
+                <m:t>,   for all k in K_{N1}</m:t>
+              </m:r>
+            </m:oMath>
+          </w:p>
+        </w:tc>
+        <w:tc>
+          <w:tcPr>
+            <w:tcW w:w="1633" w:type="dxa"/>
+            <w:tcBorders>
+              <w:top w:val="none"/>
+              <w:bottom w:val="none"/>
+              <w:left w:val="none"/>
+              <w:right w:val="none"/>
+            </w:tcBorders>
+          </w:tcPr>
+          <w:p>
+            <w:pPr>
+              <w:jc w:val="right"/>
+            </w:pPr>
+            <w:r>
+              <w:rPr>
+                <w:sz w:val="20"/>
+                <w:szCs w:val="20"/>
+                <w:rFonts w:hint="eastAsia" w:eastAsia="宋体" w:ascii="Times New Roman" w:hAnsi="Times New Roman"/>
+              </w:rPr>
+              <w:t xml:space="preserve">(F9)</w:t>
+            </w:r>
+          </w:p>
+        </w:tc>
+      </w:tr>
+    </w:tbl>
+    <w:p>
+      <w:pPr>
+        <w:jc w:val="both"/>
+        <w:spacing w:before="0" w:after="60"/>
+        <w:ind w:left="0" w:firstLine="420"/>
+      </w:pPr>
+      <w:r>
+        <w:rPr>
+          <w:sz w:val="20"/>
+          <w:szCs w:val="20"/>
+          <w:rFonts w:hint="eastAsia" w:eastAsia="宋体" w:ascii="Times New Roman" w:hAnsi="Times New Roman"/>
+        </w:rPr>
+        <w:t xml:space="preserve">式中：S^(k) 为故障拓扑T^(k)下的电压灵敏度矩阵（由LinDistFlow预计算离线存储）；P_net(t) 为节点净负荷；P_DER(t) 为DER有功出力。N-1约束将LP约束数量扩大为(|K_N1|+1)倍，可采用预先筛选最严苛预想故障（critical contingency screening）降低计算规模。</w:t>
+      </w:r>
+    </w:p>
+    <w:p>
+      <w:pPr>
+        <w:jc w:val="both"/>
+        <w:spacing w:before="0" w:after="60"/>
+        <w:ind w:left="0" w:firstLine="420"/>
+      </w:pPr>
+      <w:r>
+        <w:rPr>
+          <w:sz w:val="20"/>
+          <w:szCs w:val="20"/>
+          <w:rFonts w:hint="eastAsia" w:eastAsia="宋体" w:ascii="Times New Roman" w:hAnsi="Times New Roman"/>
+        </w:rPr>
+        <w:t xml:space="preserve">分布鲁棒机会约束形式（文献3，Rayati et al., IEEE TSG 2022）——处理故障概率分布不确定性：</w:t>
+      </w:r>
+    </w:p>
+    <w:tbl>
+      <w:tblPr>
+        <w:tblStyle w:val="TableNormal"/>
+        <w:tblW w:w="9072" w:type="dxa"/>
+        <w:tblBorders>
+          <w:top w:val="none"/>
+          <w:left w:val="none"/>
+          <w:bottom w:val="none"/>
+          <w:right w:val="none"/>
+          <w:insideH w:val="none"/>
+          <w:insideV w:val="none"/>
+        </w:tblBorders>
+      </w:tblPr>
+      <w:tr>
+        <w:tc>
+          <w:tcPr>
+            <w:tcW w:w="7439" w:type="dxa"/>
+            <w:tcBorders>
+              <w:top w:val="none"/>
+              <w:bottom w:val="none"/>
+              <w:left w:val="none"/>
+              <w:right w:val="none"/>
+            </w:tcBorders>
+          </w:tcPr>
+          <w:p>
+            <w:pPr>
+              <w:jc w:val="center"/>
+            </w:pPr>
+            <m:oMath>
+              <m:r>
+                <m:t>inf</m:t>
+              </m:r>
+              <m:sSub>
+                <m:sSubPr/>
+                <m:e>
+                  <m:r>
+                    <m:t/>
+                  </m:r>
+                </m:e>
+                <m:sub>
+                  <m:r>
+                    <m:t>P in B_eps(P_hat)</m:t>
+                  </m:r>
+                </m:sub>
+              </m:sSub>
+              <m:r>
+                <m:t> Pr(V</m:t>
+              </m:r>
+              <m:sSup>
+                <m:sSupPr/>
+                <m:e>
+                  <m:r>
+                    <m:t/>
+                  </m:r>
+                </m:e>
+                <m:sup>
+                  <m:r>
+                    <m:t>(k)</m:t>
+                  </m:r>
+                </m:sup>
+              </m:sSup>
+              <m:r>
+                <m:t>_i in [</m:t>
+              </m:r>
+              <m:sSub>
+                <m:sSubPr/>
+                <m:e>
+                  <m:r>
+                    <m:t>V</m:t>
+                  </m:r>
+                </m:e>
+                <m:sub>
+                  <m:r>
+                    <m:t>min</m:t>
+                  </m:r>
+                </m:sub>
+              </m:sSub>
+              <m:r>
+                <m:t>, </m:t>
+              </m:r>
+              <m:sSub>
+                <m:sSubPr/>
+                <m:e>
+                  <m:r>
+                    <m:t>V</m:t>
+                  </m:r>
+                </m:e>
+                <m:sub>
+                  <m:r>
+                    <m:t>max</m:t>
+                  </m:r>
+                </m:sub>
+              </m:sSub>
+              <m:r>
+                <m:t>]) &gt;= 1 - alpha,   for all k in K_{N1}</m:t>
+              </m:r>
+            </m:oMath>
+          </w:p>
+        </w:tc>
+        <w:tc>
+          <w:tcPr>
+            <w:tcW w:w="1633" w:type="dxa"/>
+            <w:tcBorders>
+              <w:top w:val="none"/>
+              <w:bottom w:val="none"/>
+              <w:left w:val="none"/>
+              <w:right w:val="none"/>
+            </w:tcBorders>
+          </w:tcPr>
+          <w:p>
+            <w:pPr>
+              <w:jc w:val="right"/>
+            </w:pPr>
+            <w:r>
+              <w:rPr>
+                <w:sz w:val="20"/>
+                <w:szCs w:val="20"/>
+                <w:rFonts w:hint="eastAsia" w:eastAsia="宋体" w:ascii="Times New Roman" w:hAnsi="Times New Roman"/>
+              </w:rPr>
+              <w:t xml:space="preserve">(F10)</w:t>
+            </w:r>
+          </w:p>
+        </w:tc>
+      </w:tr>
+    </w:tbl>
+    <w:p>
+      <w:pPr>
+        <w:jc w:val="both"/>
+        <w:spacing w:before="0" w:after="60"/>
+        <w:ind w:left="0" w:firstLine="420"/>
+      </w:pPr>
+      <w:r>
+        <w:rPr>
+          <w:sz w:val="20"/>
+          <w:szCs w:val="20"/>
+          <w:rFonts w:hint="eastAsia" w:eastAsia="宋体" w:ascii="Times New Roman" w:hAnsi="Times New Roman"/>
+        </w:rPr>
+        <w:t xml:space="preserve">式中：B_eps(P̂) 为以经验分布P̂为中心、Wasserstein半径eps的概率模糊集；1-alpha 为约束置信水平（典型取0.95~0.99）。最坏概率分布下依然满足电压安全约束，避免过保守的确定性N-1约束带来的不必要削减。</w:t>
+      </w:r>
+    </w:p>
+    <w:p>
+      <w:pPr>
+        <w:jc w:val="both"/>
+        <w:spacing w:before="0" w:after="60"/>
+        <w:ind w:left="0" w:firstLine="420"/>
+      </w:pPr>
+      <w:r>
+        <w:rPr>
+          <w:sz w:val="20"/>
+          <w:szCs w:val="20"/>
+          <w:rFonts w:hint="eastAsia" w:eastAsia="宋体" w:ascii="Times New Roman" w:hAnsi="Times New Roman"/>
+        </w:rPr>
+        <w:t xml:space="preserve">多阶段时间耦合约束（文献20，Guo et al., IEEE TPS 2025）——保证整个调度时域内N-1安全：</w:t>
+      </w:r>
+    </w:p>
+    <w:tbl>
+      <w:tblPr>
+        <w:tblStyle w:val="TableNormal"/>
+        <w:tblW w:w="9072" w:type="dxa"/>
+        <w:tblBorders>
+          <w:top w:val="none"/>
+          <w:left w:val="none"/>
+          <w:bottom w:val="none"/>
+          <w:right w:val="none"/>
+          <w:insideH w:val="none"/>
+          <w:insideV w:val="none"/>
+        </w:tblBorders>
+      </w:tblPr>
+      <w:tr>
+        <w:tc>
+          <w:tcPr>
+            <w:tcW w:w="7439" w:type="dxa"/>
+            <w:tcBorders>
+              <w:top w:val="none"/>
+              <w:bottom w:val="none"/>
+              <w:left w:val="none"/>
+              <w:right w:val="none"/>
+            </w:tcBorders>
+          </w:tcPr>
+          <w:p>
+            <w:pPr>
+              <w:jc w:val="center"/>
+            </w:pPr>
+            <m:oMath>
+              <m:r>
+                <m:t>V</m:t>
+              </m:r>
+              <m:sSup>
+                <m:sSupPr/>
+                <m:e>
+                  <m:r>
+                    <m:t/>
+                  </m:r>
+                </m:e>
+                <m:sup>
+                  <m:r>
+                    <m:t>(k)</m:t>
+                  </m:r>
+                </m:sup>
+              </m:sSup>
+              <m:r>
+                <m:t>(t) = V</m:t>
+              </m:r>
+              <m:sSup>
+                <m:sSupPr/>
+                <m:e>
+                  <m:r>
+                    <m:t/>
+                  </m:r>
+                </m:e>
+                <m:sup>
+                  <m:r>
+                    <m:t>(k)</m:t>
+                  </m:r>
+                </m:sup>
+              </m:sSup>
+              <m:r>
+                <m:t>(t-1) + S</m:t>
+              </m:r>
+              <m:sSup>
+                <m:sSupPr/>
+                <m:e>
+                  <m:r>
+                    <m:t/>
+                  </m:r>
+                </m:e>
+                <m:sup>
+                  <m:r>
+                    <m:t>(k)</m:t>
+                  </m:r>
+                </m:sup>
+              </m:sSup>
+              <m:r>
+                <m:t> * DeltaP(t),</m:t>
+              </m:r>
+              <m:r>
+                <m:t>   for all k in K_{N1}, t = 1,...,T</m:t>
+              </m:r>
+            </m:oMath>
+          </w:p>
+        </w:tc>
+        <w:tc>
+          <w:tcPr>
+            <w:tcW w:w="1633" w:type="dxa"/>
+            <w:tcBorders>
+              <w:top w:val="none"/>
+              <w:bottom w:val="none"/>
+              <w:left w:val="none"/>
+              <w:right w:val="none"/>
+            </w:tcBorders>
+          </w:tcPr>
+          <w:p>
+            <w:pPr>
+              <w:jc w:val="right"/>
+            </w:pPr>
+            <w:r>
+              <w:rPr>
+                <w:sz w:val="20"/>
+                <w:szCs w:val="20"/>
+                <w:rFonts w:hint="eastAsia" w:eastAsia="宋体" w:ascii="Times New Roman" w:hAnsi="Times New Roman"/>
+              </w:rPr>
+              <w:t xml:space="preserve">(F11)</w:t>
+            </w:r>
+          </w:p>
+        </w:tc>
+      </w:tr>
+    </w:tbl>
+    <w:p>
+      <w:pPr>
+        <w:jc w:val="both"/>
+        <w:spacing w:before="0" w:after="60"/>
+        <w:ind w:left="0" w:firstLine="420"/>
+      </w:pPr>
+      <w:r>
+        <w:rPr>
+          <w:sz w:val="20"/>
+          <w:szCs w:val="20"/>
+          <w:rFonts w:hint="eastAsia" w:eastAsia="宋体" w:ascii="Times New Roman" w:hAnsi="Times New Roman"/>
+        </w:rPr>
+        <w:t xml:space="preserve">时间耦合约束确保整个调度时域内各预想故障拓扑均满足电压安全，而非仅当前时刻，这对于水电-储能协同调度（水库容量约束、SOC约束跨时刻耦合）尤为重要。结合Proposition 1的内生储备裕度rho_min(t)，N-1约束可等价为对rho_min(t)的加严要求。</w:t>
+      </w:r>
+    </w:p>
+    <w:p>
+      <w:pPr>
+        <w:jc w:val="both"/>
+        <w:spacing w:before="0" w:after="60"/>
+      </w:pPr>
+    </w:p>
+    <w:p>
+      <w:pPr>
+        <w:jc w:val="left"/>
+        <w:spacing w:before="200" w:after="80"/>
+      </w:pPr>
+      <w:r>
+        <w:rPr>
+          <w:b/>
+          <w:bCs/>
+          <w:sz w:val="26"/>
+          <w:szCs w:val="26"/>
+          <w:color w:val="2E75B6"/>
+          <w:rFonts w:hint="eastAsia" w:eastAsia="宋体" w:ascii="Times New Roman" w:hAnsi="Times New Roman"/>
+        </w:rPr>
+        <w:t xml:space="preserve">6.6  故障后电压灵敏度矩阵重辨识——文献22扩展</w:t>
+      </w:r>
+    </w:p>
+    <w:p>
+      <w:pPr>
+        <w:jc w:val="both"/>
+        <w:spacing w:before="0" w:after="60"/>
+        <w:ind w:left="0" w:firstLine="420"/>
+      </w:pPr>
+      <w:r>
+        <w:rPr>
+          <w:sz w:val="20"/>
+          <w:szCs w:val="20"/>
+          <w:rFonts w:hint="eastAsia" w:eastAsia="宋体" w:ascii="Times New Roman" w:hAnsi="Times New Roman"/>
+        </w:rPr>
+        <w:t xml:space="preserve">文献22（Wang et al., IEEE TPS 2024）的在线自适应LSF估计在拓扑不变时具有最优追踪性能，但故障拓扑突变导致S(t)离散跳变，需检测到跳变后立即重辨识，再继续RLS递推。以下为三步重辨识流程。</w:t>
+      </w:r>
+    </w:p>
+    <w:p>
+      <w:pPr>
+        <w:jc w:val="both"/>
+        <w:spacing w:before="0" w:after="60"/>
+        <w:ind w:left="0" w:firstLine="420"/>
+      </w:pPr>
+      <w:r>
+        <w:rPr>
+          <w:sz w:val="20"/>
+          <w:szCs w:val="20"/>
+          <w:rFonts w:hint="eastAsia" w:eastAsia="宋体" w:ascii="Times New Roman" w:hAnsi="Times New Roman"/>
+        </w:rPr>
+        <w:t xml:space="preserve">步骤一：拓扑跳变检测（基于灵敏度矩阵相邻步变化量）：</w:t>
+      </w:r>
+    </w:p>
+    <w:tbl>
+      <w:tblPr>
+        <w:tblStyle w:val="TableNormal"/>
+        <w:tblW w:w="9072" w:type="dxa"/>
+        <w:tblBorders>
+          <w:top w:val="none"/>
+          <w:left w:val="none"/>
+          <w:bottom w:val="none"/>
+          <w:right w:val="none"/>
+          <w:insideH w:val="none"/>
+          <w:insideV w:val="none"/>
+        </w:tblBorders>
+      </w:tblPr>
+      <w:tr>
+        <w:tc>
+          <w:tcPr>
+            <w:tcW w:w="7439" w:type="dxa"/>
+            <w:tcBorders>
+              <w:top w:val="none"/>
+              <w:bottom w:val="none"/>
+              <w:left w:val="none"/>
+              <w:right w:val="none"/>
+            </w:tcBorders>
+          </w:tcPr>
+          <w:p>
+            <w:pPr>
+              <w:jc w:val="center"/>
+            </w:pPr>
+            <m:oMath>
+              <m:sSub>
+                <m:sSubPr/>
+                <m:e>
+                  <m:r>
+                    <m:t>delta_S</m:t>
+                  </m:r>
+                </m:e>
+                <m:sub>
+                  <m:r>
+                    <m:t>k</m:t>
+                  </m:r>
+                </m:sub>
+              </m:sSub>
+              <m:r>
+                <m:t> = ||S(k) - S(k-1)||</m:t>
+              </m:r>
+              <m:sSub>
+                <m:sSubPr/>
+                <m:e>
+                  <m:r>
+                    <m:t/>
+                  </m:r>
+                </m:e>
+                <m:sub>
+                  <m:r>
+                    <m:t>F</m:t>
+                  </m:r>
+                </m:sub>
+              </m:sSub>
+              <m:r>
+                <m:t> &gt; </m:t>
+              </m:r>
+              <m:sSub>
+                <m:sSubPr/>
+                <m:e>
+                  <m:r>
+                    <m:t>delta</m:t>
+                  </m:r>
+                </m:e>
+                <m:sub>
+                  <m:r>
+                    <m:t>th</m:t>
+                  </m:r>
+                </m:sub>
+              </m:sSub>
+              <m:r>
+                <m:t>  =&gt;  拓扑突变，触发重辨识</m:t>
+              </m:r>
+            </m:oMath>
+          </w:p>
+        </w:tc>
+        <w:tc>
+          <w:tcPr>
+            <w:tcW w:w="1633" w:type="dxa"/>
+            <w:tcBorders>
+              <w:top w:val="none"/>
+              <w:bottom w:val="none"/>
+              <w:left w:val="none"/>
+              <w:right w:val="none"/>
+            </w:tcBorders>
+          </w:tcPr>
+          <w:p>
+            <w:pPr>
+              <w:jc w:val="right"/>
+            </w:pPr>
+            <w:r>
+              <w:rPr>
+                <w:sz w:val="20"/>
+                <w:szCs w:val="20"/>
+                <w:rFonts w:hint="eastAsia" w:eastAsia="宋体" w:ascii="Times New Roman" w:hAnsi="Times New Roman"/>
+              </w:rPr>
+              <w:t xml:space="preserve">(F12)</w:t>
+            </w:r>
+          </w:p>
+        </w:tc>
+      </w:tr>
+    </w:tbl>
+    <w:p>
+      <w:pPr>
+        <w:jc w:val="both"/>
+        <w:spacing w:before="0" w:after="60"/>
+        <w:ind w:left="0" w:firstLine="420"/>
+      </w:pPr>
+      <w:r>
+        <w:rPr>
+          <w:sz w:val="20"/>
+          <w:szCs w:val="20"/>
+          <w:rFonts w:hint="eastAsia" w:eastAsia="宋体" w:ascii="Times New Roman" w:hAnsi="Times New Roman"/>
+        </w:rPr>
+        <w:t xml:space="preserve">式中：||·||_F 为Frobenius范数；delta_th 由正常运行期灵敏度波动方差sigma_S确定（建议delta_th = 3*sigma_S）；检测延迟不超过一个控制周期（1 s），及时触发重辨识，不影响在线调度。</w:t>
+      </w:r>
+    </w:p>
+    <w:p>
+      <w:pPr>
+        <w:jc w:val="both"/>
+        <w:spacing w:before="0" w:after="60"/>
+        <w:ind w:left="0" w:firstLine="420"/>
+      </w:pPr>
+      <w:r>
+        <w:rPr>
+          <w:sz w:val="20"/>
+          <w:szCs w:val="20"/>
+          <w:rFonts w:hint="eastAsia" w:eastAsia="宋体" w:ascii="Times New Roman" w:hAnsi="Times New Roman"/>
+        </w:rPr>
+        <w:t xml:space="preserve">步骤二：最近邻预想故障匹配，灵敏度矩阵重初始化：</w:t>
+      </w:r>
+    </w:p>
+    <w:tbl>
+      <w:tblPr>
+        <w:tblStyle w:val="TableNormal"/>
+        <w:tblW w:w="9072" w:type="dxa"/>
+        <w:tblBorders>
+          <w:top w:val="none"/>
+          <w:left w:val="none"/>
+          <w:bottom w:val="none"/>
+          <w:right w:val="none"/>
+          <w:insideH w:val="none"/>
+          <w:insideV w:val="none"/>
+        </w:tblBorders>
+      </w:tblPr>
+      <w:tr>
+        <w:tc>
+          <w:tcPr>
+            <w:tcW w:w="7439" w:type="dxa"/>
+            <w:tcBorders>
+              <w:top w:val="none"/>
+              <w:bottom w:val="none"/>
+              <w:left w:val="none"/>
+              <w:right w:val="none"/>
+            </w:tcBorders>
+          </w:tcPr>
+          <w:p>
+            <w:pPr>
+              <w:jc w:val="center"/>
+            </w:pPr>
+            <m:oMath>
+              <m:r>
+                <m:t>S(t_f+) = </m:t>
+              </m:r>
+              <m:sSup>
+                <m:sSupPr/>
+                <m:e>
+                  <m:sSub>
+                    <m:sSubPr/>
+                    <m:e>
+                      <m:r>
+                        <m:t>S</m:t>
+                      </m:r>
+                    </m:e>
+                    <m:sub>
+                      <m:r>
+                        <m:t>0</m:t>
+                      </m:r>
+                    </m:sub>
+                  </m:sSub>
+                </m:e>
+                <m:sup>
+                  <m:r>
+                    <m:t>(k*)</m:t>
+                  </m:r>
+                </m:sup>
+              </m:sSup>
+              <m:r>
+                <m:t>,   k* = argmin</m:t>
+              </m:r>
+              <m:sSub>
+                <m:sSubPr/>
+                <m:e>
+                  <m:r>
+                    <m:t/>
+                  </m:r>
+                </m:e>
+                <m:sub>
+                  <m:r>
+                    <m:t>k in K_{N1}</m:t>
+                  </m:r>
+                </m:sub>
+              </m:sSub>
+              <m:r>
+                <m:t> ||T_meas - T</m:t>
+              </m:r>
+              <m:sSup>
+                <m:sSupPr/>
+                <m:e>
+                  <m:r>
+                    <m:t/>
+                  </m:r>
+                </m:e>
+                <m:sup>
+                  <m:r>
+                    <m:t>(k)</m:t>
+                  </m:r>
+                </m:sup>
+              </m:sSup>
+              <m:r>
+                <m:t>||</m:t>
+              </m:r>
+              <m:sSub>
+                <m:sSubPr/>
+                <m:e>
+                  <m:r>
+                    <m:t/>
+                  </m:r>
+                </m:e>
+                <m:sub>
+                  <m:r>
+                    <m:t>F</m:t>
+                  </m:r>
+                </m:sub>
+              </m:sSub>
+            </m:oMath>
+          </w:p>
+        </w:tc>
+        <w:tc>
+          <w:tcPr>
+            <w:tcW w:w="1633" w:type="dxa"/>
+            <w:tcBorders>
+              <w:top w:val="none"/>
+              <w:bottom w:val="none"/>
+              <w:left w:val="none"/>
+              <w:right w:val="none"/>
+            </w:tcBorders>
+          </w:tcPr>
+          <w:p>
+            <w:pPr>
+              <w:jc w:val="right"/>
+            </w:pPr>
+            <w:r>
+              <w:rPr>
+                <w:sz w:val="20"/>
+                <w:szCs w:val="20"/>
+                <w:rFonts w:hint="eastAsia" w:eastAsia="宋体" w:ascii="Times New Roman" w:hAnsi="Times New Roman"/>
+              </w:rPr>
+              <w:t xml:space="preserve">(F13)</w:t>
+            </w:r>
+          </w:p>
+        </w:tc>
+      </w:tr>
+    </w:tbl>
+    <w:p>
+      <w:pPr>
+        <w:jc w:val="both"/>
+        <w:spacing w:before="0" w:after="60"/>
+        <w:ind w:left="0" w:firstLine="420"/>
+      </w:pPr>
+      <w:r>
+        <w:rPr>
+          <w:sz w:val="20"/>
+          <w:szCs w:val="20"/>
+          <w:rFonts w:hint="eastAsia" w:eastAsia="宋体" w:ascii="Times New Roman" w:hAnsi="Times New Roman"/>
+        </w:rPr>
+        <w:t xml:space="preserve">式中：S^(k*)_0 为预想故障k*的LinDistFlow解析灵敏度（预计算离线存储）；T_meas 由量测电流向量估计当前拓扑特征，通过最近邻匹配快速定位开断支路，全过程无需停止在线调度，单步完成初始化。</w:t>
+      </w:r>
+    </w:p>
+    <w:p>
+      <w:pPr>
+        <w:jc w:val="both"/>
+        <w:spacing w:before="0" w:after="60"/>
+        <w:ind w:left="0" w:firstLine="420"/>
+      </w:pPr>
+      <w:r>
+        <w:rPr>
+          <w:sz w:val="20"/>
+          <w:szCs w:val="20"/>
+          <w:rFonts w:hint="eastAsia" w:eastAsia="宋体" w:ascii="Times New Roman" w:hAnsi="Times New Roman"/>
+        </w:rPr>
+        <w:t xml:space="preserve">步骤三：重初始化后继续Tukey鲁棒RLS递推（与文献4式39形式一致，在故障后量测异常期间抑制异常值污染）：</w:t>
+      </w:r>
+    </w:p>
+    <w:tbl>
+      <w:tblPr>
+        <w:tblStyle w:val="TableNormal"/>
+        <w:tblW w:w="9072" w:type="dxa"/>
+        <w:tblBorders>
+          <w:top w:val="none"/>
+          <w:left w:val="none"/>
+          <w:bottom w:val="none"/>
+          <w:right w:val="none"/>
+          <w:insideH w:val="none"/>
+          <w:insideV w:val="none"/>
+        </w:tblBorders>
+      </w:tblPr>
+      <w:tr>
+        <w:tc>
+          <w:tcPr>
+            <w:tcW w:w="7439" w:type="dxa"/>
+            <w:tcBorders>
+              <w:top w:val="none"/>
+              <w:bottom w:val="none"/>
+              <w:left w:val="none"/>
+              <w:right w:val="none"/>
+            </w:tcBorders>
+          </w:tcPr>
+          <w:p>
+            <w:pPr>
+              <w:jc w:val="center"/>
+            </w:pPr>
+            <m:oMath>
+              <m:r>
+                <m:t>S(t+1) = S(t) + gamma * [DeltaV(t) - S(t)*DeltaP(t)] * </m:t>
+              </m:r>
+              <m:f>
+                <m:fPr/>
+                <m:num>
+                  <m:r>
+                    <m:t>DeltaP(t)^T</m:t>
+                  </m:r>
+                </m:num>
+                <m:den>
+                  <m:r>
+                    <m:t>||DeltaP(t)||^2 + eps</m:t>
+                  </m:r>
+                </m:den>
+              </m:f>
+            </m:oMath>
+          </w:p>
+        </w:tc>
+        <w:tc>
+          <w:tcPr>
+            <w:tcW w:w="1633" w:type="dxa"/>
+            <w:tcBorders>
+              <w:top w:val="none"/>
+              <w:bottom w:val="none"/>
+              <w:left w:val="none"/>
+              <w:right w:val="none"/>
+            </w:tcBorders>
+          </w:tcPr>
+          <w:p>
+            <w:pPr>
+              <w:jc w:val="right"/>
+            </w:pPr>
+            <w:r>
+              <w:rPr>
+                <w:sz w:val="20"/>
+                <w:szCs w:val="20"/>
+                <w:rFonts w:hint="eastAsia" w:eastAsia="宋体" w:ascii="Times New Roman" w:hAnsi="Times New Roman"/>
+              </w:rPr>
+              <w:t xml:space="preserve">(F14)</w:t>
+            </w:r>
+          </w:p>
+        </w:tc>
+      </w:tr>
+    </w:tbl>
+    <w:p>
+      <w:pPr>
+        <w:jc w:val="both"/>
+        <w:spacing w:before="0" w:after="60"/>
+        <w:ind w:left="0" w:firstLine="420"/>
+      </w:pPr>
+      <w:r>
+        <w:rPr>
+          <w:sz w:val="20"/>
+          <w:szCs w:val="20"/>
+          <w:rFonts w:hint="eastAsia" w:eastAsia="宋体" w:ascii="Times New Roman" w:hAnsi="Times New Roman"/>
+        </w:rPr>
+        <w:t xml:space="preserve">采用Tukey双权鲁棒损失在故障后量测异常期间（电机振荡、保护动作引起测量突跳）抑制其对LSF估计的污染，通常约5~10个控制周期（每步1 s）内S(t)收敛至故障拓扑下的真实灵敏度值，为后续重规划提供准确的S^(k*)。</w:t>
+      </w:r>
+    </w:p>
+    <w:p>
+      <w:pPr>
+        <w:jc w:val="both"/>
+        <w:spacing w:before="0" w:after="60"/>
+      </w:pPr>
+    </w:p>
+    <w:p>
+      <w:pPr>
+        <w:jc w:val="left"/>
+        <w:spacing w:before="200" w:after="80"/>
+      </w:pPr>
+      <w:r>
+        <w:rPr>
+          <w:b/>
+          <w:bCs/>
+          <w:sz w:val="26"/>
+          <w:szCs w:val="26"/>
+          <w:color w:val="2E75B6"/>
+          <w:rFonts w:hint="eastAsia" w:eastAsia="宋体" w:ascii="Times New Roman" w:hAnsi="Times New Roman"/>
+        </w:rPr>
+        <w:t xml:space="preserve">6.7  三阶段框架故障扩展综合方案——文献18与文献25</w:t>
+      </w:r>
+    </w:p>
+    <w:p>
+      <w:pPr>
+        <w:jc w:val="both"/>
+        <w:spacing w:before="0" w:after="60"/>
+        <w:ind w:left="0" w:firstLine="420"/>
+      </w:pPr>
+      <w:r>
+        <w:rPr>
+          <w:sz w:val="20"/>
+          <w:szCs w:val="20"/>
+          <w:rFonts w:hint="eastAsia" w:eastAsia="宋体" w:ascii="Times New Roman" w:hAnsi="Times New Roman"/>
+        </w:rPr>
+        <w:t xml:space="preserve">文献18（Zhang et al., IEEE TSTE 2022）的三阶段层级Volt-Var控制结构与本框架高度对应，且层级设计天然适配故障响应的时间尺度分解：①毫秒级——保护动作（不在本框架范围）；②秒级——储能快速响应（事中阶段，文献15的STL控制律，式F6）；③分钟级——水电重规划（事件触发重规划阶段，引入N-1约束，式F9）。这一时间尺度分解验证了将故障处理分层嵌入现有三阶段框架的合理性，无需重构框架结构。</w:t>
+      </w:r>
+    </w:p>
+    <w:p>
+      <w:pPr>
+        <w:jc w:val="both"/>
+        <w:spacing w:before="0" w:after="60"/>
+        <w:ind w:left="0" w:firstLine="420"/>
+      </w:pPr>
+      <w:r>
+        <w:rPr>
+          <w:sz w:val="20"/>
+          <w:szCs w:val="20"/>
+          <w:rFonts w:hint="eastAsia" w:eastAsia="宋体" w:ascii="Times New Roman" w:hAnsi="Times New Roman"/>
+        </w:rPr>
+        <w:t xml:space="preserve">文献25（Li et al., IEEE TSG 2024）的分布鲁棒MPC将故障视为动态不确定性事件（拓扑跳变随机发生），在预规划时域N内预留弹性裕度。DR-MPC优化目标：</w:t>
+      </w:r>
+    </w:p>
+    <w:tbl>
+      <w:tblPr>
+        <w:tblStyle w:val="TableNormal"/>
+        <w:tblW w:w="9072" w:type="dxa"/>
+        <w:tblBorders>
+          <w:top w:val="none"/>
+          <w:left w:val="none"/>
+          <w:bottom w:val="none"/>
+          <w:right w:val="none"/>
+          <w:insideH w:val="none"/>
+          <w:insideV w:val="none"/>
+        </w:tblBorders>
+      </w:tblPr>
+      <w:tr>
+        <w:tc>
+          <w:tcPr>
+            <w:tcW w:w="7439" w:type="dxa"/>
+            <w:tcBorders>
+              <w:top w:val="none"/>
+              <w:bottom w:val="none"/>
+              <w:left w:val="none"/>
+              <w:right w:val="none"/>
+            </w:tcBorders>
+          </w:tcPr>
+          <w:p>
+            <w:pPr>
+              <w:jc w:val="center"/>
+            </w:pPr>
+            <m:oMath>
+              <m:r>
+                <m:t>min</m:t>
+              </m:r>
+              <m:sSub>
+                <m:sSubPr/>
+                <m:e>
+                  <m:r>
+                    <m:t>_u</m:t>
+                  </m:r>
+                </m:e>
+                <m:sub>
+                  <m:r>
+                    <m:t/>
+                  </m:r>
+                </m:sub>
+              </m:sSub>
+              <m:r>
+                <m:t>  max</m:t>
+              </m:r>
+              <m:sSub>
+                <m:sSubPr/>
+                <m:e>
+                  <m:r>
+                    <m:t/>
+                  </m:r>
+                </m:e>
+                <m:sub>
+                  <m:r>
+                    <m:t>P in B_W(P_hat)</m:t>
+                  </m:r>
+                </m:sub>
+              </m:sSub>
+              <m:r>
+                <m:t>  E</m:t>
+              </m:r>
+              <m:sSub>
+                <m:sSubPr/>
+                <m:e>
+                  <m:r>
+                    <m:t>_P</m:t>
+                  </m:r>
+                </m:e>
+                <m:sub>
+                  <m:r>
+                    <m:t/>
+                  </m:r>
+                </m:sub>
+              </m:sSub>
+              <m:r>
+                <m:t>[</m:t>
+              </m:r>
+              <m:sSub>
+                <m:sSubPr/>
+                <m:e>
+                  <m:r>
+                    <m:t>SUM</m:t>
+                  </m:r>
+                </m:e>
+                <m:sub>
+                  <m:r>
+                    <m:t>t=k,...,k+N-1</m:t>
+                  </m:r>
+                </m:sub>
+              </m:sSub>
+              <m:r>
+                <m:t> l(</m:t>
+              </m:r>
+              <m:sSub>
+                <m:sSubPr/>
+                <m:e>
+                  <m:r>
+                    <m:t>x</m:t>
+                  </m:r>
+                </m:e>
+                <m:sub>
+                  <m:r>
+                    <m:t>t</m:t>
+                  </m:r>
+                </m:sub>
+              </m:sSub>
+              <m:r>
+                <m:t>, </m:t>
+              </m:r>
+              <m:sSub>
+                <m:sSubPr/>
+                <m:e>
+                  <m:r>
+                    <m:t>u</m:t>
+                  </m:r>
+                </m:e>
+                <m:sub>
+                  <m:r>
+                    <m:t>t</m:t>
+                  </m:r>
+                </m:sub>
+              </m:sSub>
+              <m:r>
+                <m:t>)]</m:t>
+              </m:r>
+            </m:oMath>
+          </w:p>
+        </w:tc>
+        <w:tc>
+          <w:tcPr>
+            <w:tcW w:w="1633" w:type="dxa"/>
+            <w:tcBorders>
+              <w:top w:val="none"/>
+              <w:bottom w:val="none"/>
+              <w:left w:val="none"/>
+              <w:right w:val="none"/>
+            </w:tcBorders>
+          </w:tcPr>
+          <w:p>
+            <w:pPr>
+              <w:jc w:val="right"/>
+            </w:pPr>
+            <w:r>
+              <w:rPr>
+                <w:sz w:val="20"/>
+                <w:szCs w:val="20"/>
+                <w:rFonts w:hint="eastAsia" w:eastAsia="宋体" w:ascii="Times New Roman" w:hAnsi="Times New Roman"/>
+              </w:rPr>
+              <w:t xml:space="preserve">(F15)</w:t>
+            </w:r>
+          </w:p>
+        </w:tc>
+      </w:tr>
+    </w:tbl>
+    <w:p>
+      <w:pPr>
+        <w:jc w:val="both"/>
+        <w:spacing w:before="0" w:after="60"/>
+        <w:ind w:left="0" w:firstLine="420"/>
+      </w:pPr>
+      <w:r>
+        <w:rPr>
+          <w:sz w:val="20"/>
+          <w:szCs w:val="20"/>
+          <w:rFonts w:hint="eastAsia" w:eastAsia="宋体" w:ascii="Times New Roman" w:hAnsi="Times New Roman"/>
+        </w:rPr>
+        <w:t xml:space="preserve">式中：B_W(P̂) 为Wasserstein距离球内的概率模糊集，覆盖正常运行不确定性（PV/负荷波动）和低概率故障场景；l(x_t, u_t) 为运行代价（网损+调节成本）。</w:t>
+      </w:r>
+    </w:p>
+    <w:p>
+      <w:pPr>
+        <w:jc w:val="both"/>
+        <w:spacing w:before="0" w:after="60"/>
+        <w:ind w:left="0" w:firstLine="420"/>
+      </w:pPr>
+      <w:r>
+        <w:rPr>
+          <w:sz w:val="20"/>
+          <w:szCs w:val="20"/>
+          <w:rFonts w:hint="eastAsia" w:eastAsia="宋体" w:ascii="Times New Roman" w:hAnsi="Times New Roman"/>
+        </w:rPr>
+        <w:t xml:space="preserve">故障条件下的电压安全概率约束（结合N-1预想故障集，式F10的DR-MPC扩展）：</w:t>
+      </w:r>
+    </w:p>
+    <w:tbl>
+      <w:tblPr>
+        <w:tblStyle w:val="TableNormal"/>
+        <w:tblW w:w="9072" w:type="dxa"/>
+        <w:tblBorders>
+          <w:top w:val="none"/>
+          <w:left w:val="none"/>
+          <w:bottom w:val="none"/>
+          <w:right w:val="none"/>
+          <w:insideH w:val="none"/>
+          <w:insideV w:val="none"/>
+        </w:tblBorders>
+      </w:tblPr>
+      <w:tr>
+        <w:tc>
+          <w:tcPr>
+            <w:tcW w:w="7439" w:type="dxa"/>
+            <w:tcBorders>
+              <w:top w:val="none"/>
+              <w:bottom w:val="none"/>
+              <w:left w:val="none"/>
+              <w:right w:val="none"/>
+            </w:tcBorders>
+          </w:tcPr>
+          <w:p>
+            <w:pPr>
+              <w:jc w:val="center"/>
+            </w:pPr>
+            <m:oMath>
+              <m:r>
+                <m:t>Pr(</m:t>
+              </m:r>
+              <m:sSub>
+                <m:sSubPr/>
+                <m:e>
+                  <m:r>
+                    <m:t>V</m:t>
+                  </m:r>
+                </m:e>
+                <m:sub>
+                  <m:r>
+                    <m:t>t</m:t>
+                  </m:r>
+                </m:sub>
+              </m:sSub>
+              <m:r>
+                <m:t> in </m:t>
+              </m:r>
+              <m:sSub>
+                <m:sSubPr/>
+                <m:e>
+                  <m:r>
+                    <m:t>X</m:t>
+                  </m:r>
+                </m:e>
+                <m:sub>
+                  <m:r>
+                    <m:t>safe</m:t>
+                  </m:r>
+                </m:sub>
+              </m:sSub>
+              <m:r>
+                <m:t> | T</m:t>
+              </m:r>
+              <m:sSup>
+                <m:sSupPr/>
+                <m:e>
+                  <m:r>
+                    <m:t/>
+                  </m:r>
+                </m:e>
+                <m:sup>
+                  <m:r>
+                    <m:t>(k)</m:t>
+                  </m:r>
+                </m:sup>
+              </m:sSup>
+              <m:r>
+                <m:t>) &gt;= 1 - </m:t>
+              </m:r>
+              <m:sSub>
+                <m:sSubPr/>
+                <m:e>
+                  <m:r>
+                    <m:t>alpha</m:t>
+                  </m:r>
+                </m:e>
+                <m:sub>
+                  <m:r>
+                    <m:t>k</m:t>
+                  </m:r>
+                </m:sub>
+              </m:sSub>
+              <m:r>
+                <m:t>,   for all k in K_{N1}, t = 1,...,T</m:t>
+              </m:r>
+            </m:oMath>
+          </w:p>
+        </w:tc>
+        <w:tc>
+          <w:tcPr>
+            <w:tcW w:w="1633" w:type="dxa"/>
+            <w:tcBorders>
+              <w:top w:val="none"/>
+              <w:bottom w:val="none"/>
+              <w:left w:val="none"/>
+              <w:right w:val="none"/>
+            </w:tcBorders>
+          </w:tcPr>
+          <w:p>
+            <w:pPr>
+              <w:jc w:val="right"/>
+            </w:pPr>
+            <w:r>
+              <w:rPr>
+                <w:sz w:val="20"/>
+                <w:szCs w:val="20"/>
+                <w:rFonts w:hint="eastAsia" w:eastAsia="宋体" w:ascii="Times New Roman" w:hAnsi="Times New Roman"/>
+              </w:rPr>
+              <w:t xml:space="preserve">(F16)</w:t>
+            </w:r>
+          </w:p>
+        </w:tc>
+      </w:tr>
+    </w:tbl>
+    <w:p>
+      <w:pPr>
+        <w:jc w:val="both"/>
+        <w:spacing w:before="0" w:after="60"/>
+        <w:ind w:left="0" w:firstLine="420"/>
+      </w:pPr>
+      <w:r>
+        <w:rPr>
+          <w:sz w:val="20"/>
+          <w:szCs w:val="20"/>
+          <w:rFonts w:hint="eastAsia" w:eastAsia="宋体" w:ascii="Times New Roman" w:hAnsi="Times New Roman"/>
+        </w:rPr>
+        <w:t xml:space="preserve">式中：X_safe = [V_min, V_max]^n 为节点电压安全集合；alpha_k 为第k个预想故障的约束违反容忍率，可按故障严重性分级设置（严重故障alpha_k更小，约束更紧）。DR-MPC通过在Wasserstein球内最大化期望代价，将弹性裕度内嵌至预规划，使三阶段框架在面对低概率故障时具备足够的鲁棒储备。</w:t>
+      </w:r>
+    </w:p>
+    <w:p>
+      <w:pPr>
+        <w:jc w:val="both"/>
+        <w:spacing w:before="0" w:after="60"/>
+      </w:pPr>
+    </w:p>
+    <w:p>
+      <w:pPr>
+        <w:jc w:val="left"/>
+        <w:spacing w:before="200" w:after="80"/>
+      </w:pPr>
+      <w:r>
+        <w:rPr>
+          <w:b/>
+          <w:bCs/>
+          <w:sz w:val="26"/>
+          <w:szCs w:val="26"/>
+          <w:color w:val="2E75B6"/>
+          <w:rFonts w:hint="eastAsia" w:eastAsia="宋体" w:ascii="Times New Roman" w:hAnsi="Times New Roman"/>
+        </w:rPr>
+        <w:t xml:space="preserve">6.8  故障扩展相关文献综合对比</w:t>
+      </w:r>
+    </w:p>
+    <w:tbl>
+      <w:tblPr>
+        <w:tblStyle w:val="TableNormal"/>
+        <w:tblW w:w="8900" w:type="dxa"/>
+        <w:tblBorders>
+          <w:top w:val="single" w:sz="4" w:space="0" w:color="2E75B6"/>
+          <w:left w:val="single" w:sz="4" w:space="0" w:color="2E75B6"/>
+          <w:bottom w:val="single" w:sz="4" w:space="0" w:color="2E75B6"/>
+          <w:right w:val="single" w:sz="4" w:space="0" w:color="2E75B6"/>
+          <w:insideH w:val="single" w:sz="4" w:space="0" w:color="2E75B6"/>
+          <w:insideV w:val="single" w:sz="4" w:space="0" w:color="2E75B6"/>
+        </w:tblBorders>
+      </w:tblPr>
+      <w:tr>
+        <w:tc>
+          <w:tcPr>
+            <w:tcW w:w="1500" w:type="dxa"/>
+            <w:shd w:val="clear" w:color="auto" w:fill="D9E1F2"/>
+          </w:tcPr>
+          <w:p>
+            <w:pPr>
+              <w:jc w:val="center"/>
+              <w:spacing w:before="40" w:after="40"/>
+            </w:pPr>
+            <w:r>
+              <w:rPr>
+                <w:b/>
+                <w:bCs/>
+                <w:sz w:val="18"/>
+                <w:szCs w:val="18"/>
+                <w:rFonts w:hint="eastAsia" w:eastAsia="宋体" w:ascii="Times New Roman" w:hAnsi="Times New Roman"/>
+              </w:rPr>
+              <w:t xml:space="preserve">文献（序号）</w:t>
+            </w:r>
+          </w:p>
+        </w:tc>
+        <w:tc>
+          <w:tcPr>
+            <w:tcW w:w="1850" w:type="dxa"/>
+            <w:shd w:val="clear" w:color="auto" w:fill="D9E1F2"/>
+          </w:tcPr>
+          <w:p>
+            <w:pPr>
+              <w:jc w:val="center"/>
+              <w:spacing w:before="40" w:after="40"/>
+            </w:pPr>
+            <w:r>
+              <w:rPr>
+                <w:b/>
+                <w:bCs/>
+                <w:sz w:val="18"/>
+                <w:szCs w:val="18"/>
+                <w:rFonts w:hint="eastAsia" w:eastAsia="宋体" w:ascii="Times New Roman" w:hAnsi="Times New Roman"/>
+              </w:rPr>
+              <w:t xml:space="preserve">核心技术贡献</w:t>
+            </w:r>
+          </w:p>
+        </w:tc>
+        <w:tc>
+          <w:tcPr>
+            <w:tcW w:w="1850" w:type="dxa"/>
+            <w:shd w:val="clear" w:color="auto" w:fill="D9E1F2"/>
+          </w:tcPr>
+          <w:p>
+            <w:pPr>
+              <w:jc w:val="center"/>
+              <w:spacing w:before="40" w:after="40"/>
+            </w:pPr>
+            <w:r>
+              <w:rPr>
+                <w:b/>
+                <w:bCs/>
+                <w:sz w:val="18"/>
+                <w:szCs w:val="18"/>
+                <w:rFonts w:hint="eastAsia" w:eastAsia="宋体" w:ascii="Times New Roman" w:hAnsi="Times New Roman"/>
+              </w:rPr>
+              <w:t xml:space="preserve">对应框架扩展环节</w:t>
+            </w:r>
+          </w:p>
+        </w:tc>
+        <w:tc>
+          <w:tcPr>
+            <w:tcW w:w="1850" w:type="dxa"/>
+            <w:shd w:val="clear" w:color="auto" w:fill="D9E1F2"/>
+          </w:tcPr>
+          <w:p>
+            <w:pPr>
+              <w:jc w:val="center"/>
+              <w:spacing w:before="40" w:after="40"/>
+            </w:pPr>
+            <w:r>
+              <w:rPr>
+                <w:b/>
+                <w:bCs/>
+                <w:sz w:val="18"/>
+                <w:szCs w:val="18"/>
+                <w:rFonts w:hint="eastAsia" w:eastAsia="宋体" w:ascii="Times New Roman" w:hAnsi="Times New Roman"/>
+              </w:rPr>
+              <w:t xml:space="preserve">主要适用场景</w:t>
+            </w:r>
+          </w:p>
+        </w:tc>
+        <w:tc>
+          <w:tcPr>
+            <w:tcW w:w="1850" w:type="dxa"/>
+            <w:shd w:val="clear" w:color="auto" w:fill="D9E1F2"/>
+          </w:tcPr>
+          <w:p>
+            <w:pPr>
+              <w:jc w:val="center"/>
+              <w:spacing w:before="40" w:after="40"/>
+            </w:pPr>
+            <w:r>
+              <w:rPr>
+                <w:b/>
+                <w:bCs/>
+                <w:sz w:val="18"/>
+                <w:szCs w:val="18"/>
+                <w:rFonts w:hint="eastAsia" w:eastAsia="宋体" w:ascii="Times New Roman" w:hAnsi="Times New Roman"/>
+              </w:rPr>
+              <w:t xml:space="preserve">优先级</w:t>
+            </w:r>
+          </w:p>
+        </w:tc>
+      </w:tr>
+      <w:tr>
+        <w:tc>
+          <w:tcPr>
+            <w:tcW w:w="1500" w:type="dxa"/>
+            <w:shd w:val="clear" w:color="auto" w:fill="EBF3FA"/>
+          </w:tcPr>
+          <w:p>
+            <w:pPr>
+              <w:jc w:val="center"/>
+              <w:spacing w:before="40" w:after="40"/>
+            </w:pPr>
+            <w:r>
+              <w:rPr>
+                <w:b/>
+                <w:bCs/>
+                <w:sz w:val="18"/>
+                <w:szCs w:val="18"/>
+                <w:rFonts w:hint="eastAsia" w:eastAsia="宋体" w:ascii="Times New Roman" w:hAnsi="Times New Roman"/>
+              </w:rPr>
+              <w:t xml:space="preserve">文献6（Wang）</w:t>
+            </w:r>
+          </w:p>
+        </w:tc>
+        <w:tc>
+          <w:tcPr>
+            <w:tcW w:w="1850" w:type="dxa"/>
+            <w:shd w:val="clear" w:color="auto" w:fill="FFFFFF"/>
+          </w:tcPr>
+          <w:p>
+            <w:pPr>
+              <w:jc w:val="center"/>
+              <w:spacing w:before="40" w:after="40"/>
+            </w:pPr>
+            <w:r>
+              <w:rPr>
+                <w:sz w:val="18"/>
+                <w:szCs w:val="18"/>
+                <w:rFonts w:hint="eastAsia" w:eastAsia="宋体" w:ascii="Times New Roman" w:hAnsi="Times New Roman"/>
+              </w:rPr>
+              <w:t xml:space="preserve">SOP柔性拓扑切换</w:t>
+            </w:r>
+          </w:p>
+        </w:tc>
+        <w:tc>
+          <w:tcPr>
+            <w:tcW w:w="1850" w:type="dxa"/>
+            <w:shd w:val="clear" w:color="auto" w:fill="FFFFFF"/>
+          </w:tcPr>
+          <w:p>
+            <w:pPr>
+              <w:jc w:val="center"/>
+              <w:spacing w:before="40" w:after="40"/>
+            </w:pPr>
+            <w:r>
+              <w:rPr>
+                <w:sz w:val="18"/>
+                <w:szCs w:val="18"/>
+                <w:rFonts w:hint="eastAsia" w:eastAsia="宋体" w:ascii="Times New Roman" w:hAnsi="Times New Roman"/>
+              </w:rPr>
+              <w:t xml:space="preserve">触发机制：故障触发</w:t>
+            </w:r>
+          </w:p>
+        </w:tc>
+        <w:tc>
+          <w:tcPr>
+            <w:tcW w:w="1850" w:type="dxa"/>
+            <w:shd w:val="clear" w:color="auto" w:fill="FFFFFF"/>
+          </w:tcPr>
+          <w:p>
+            <w:pPr>
+              <w:jc w:val="center"/>
+              <w:spacing w:before="40" w:after="40"/>
+            </w:pPr>
+            <w:r>
+              <w:rPr>
+                <w:sz w:val="18"/>
+                <w:szCs w:val="18"/>
+                <w:rFonts w:hint="eastAsia" w:eastAsia="宋体" w:ascii="Times New Roman" w:hAnsi="Times New Roman"/>
+              </w:rPr>
+              <w:t xml:space="preserve">N-1支路开断+重构</w:t>
+            </w:r>
+          </w:p>
+        </w:tc>
+        <w:tc>
+          <w:tcPr>
+            <w:tcW w:w="1850" w:type="dxa"/>
+            <w:shd w:val="clear" w:color="auto" w:fill="FFFFFF"/>
+          </w:tcPr>
+          <w:p>
+            <w:pPr>
+              <w:jc w:val="center"/>
+              <w:spacing w:before="40" w:after="40"/>
+            </w:pPr>
+            <w:r>
+              <w:rPr>
+                <w:sz w:val="18"/>
+                <w:szCs w:val="18"/>
+                <w:rFonts w:hint="eastAsia" w:eastAsia="宋体" w:ascii="Times New Roman" w:hAnsi="Times New Roman"/>
+              </w:rPr>
+              <w:t xml:space="preserve">★★★</w:t>
+            </w:r>
+          </w:p>
+        </w:tc>
+      </w:tr>
+      <w:tr>
+        <w:tc>
+          <w:tcPr>
+            <w:tcW w:w="1500" w:type="dxa"/>
+            <w:shd w:val="clear" w:color="auto" w:fill="EBF3FA"/>
+          </w:tcPr>
+          <w:p>
+            <w:pPr>
+              <w:jc w:val="center"/>
+              <w:spacing w:before="40" w:after="40"/>
+            </w:pPr>
+            <w:r>
+              <w:rPr>
+                <w:b/>
+                <w:bCs/>
+                <w:sz w:val="18"/>
+                <w:szCs w:val="18"/>
+                <w:rFonts w:hint="eastAsia" w:eastAsia="宋体" w:ascii="Times New Roman" w:hAnsi="Times New Roman"/>
+              </w:rPr>
+              <w:t xml:space="preserve">文献15（Park）</w:t>
+            </w:r>
+          </w:p>
+        </w:tc>
+        <w:tc>
+          <w:tcPr>
+            <w:tcW w:w="1850" w:type="dxa"/>
+            <w:shd w:val="clear" w:color="auto" w:fill="FFFFFF"/>
+          </w:tcPr>
+          <w:p>
+            <w:pPr>
+              <w:jc w:val="center"/>
+              <w:spacing w:before="40" w:after="40"/>
+            </w:pPr>
+            <w:r>
+              <w:rPr>
+                <w:sz w:val="18"/>
+                <w:szCs w:val="18"/>
+                <w:rFonts w:hint="eastAsia" w:eastAsia="宋体" w:ascii="Times New Roman" w:hAnsi="Times New Roman"/>
+              </w:rPr>
+              <w:t xml:space="preserve">ESS+STL的FIDVR抑制</w:t>
+            </w:r>
+          </w:p>
+        </w:tc>
+        <w:tc>
+          <w:tcPr>
+            <w:tcW w:w="1850" w:type="dxa"/>
+            <w:shd w:val="clear" w:color="auto" w:fill="FFFFFF"/>
+          </w:tcPr>
+          <w:p>
+            <w:pPr>
+              <w:jc w:val="center"/>
+              <w:spacing w:before="40" w:after="40"/>
+            </w:pPr>
+            <w:r>
+              <w:rPr>
+                <w:sz w:val="18"/>
+                <w:szCs w:val="18"/>
+                <w:rFonts w:hint="eastAsia" w:eastAsia="宋体" w:ascii="Times New Roman" w:hAnsi="Times New Roman"/>
+              </w:rPr>
+              <w:t xml:space="preserve">事中：储能紧急控制</w:t>
+            </w:r>
+          </w:p>
+        </w:tc>
+        <w:tc>
+          <w:tcPr>
+            <w:tcW w:w="1850" w:type="dxa"/>
+            <w:shd w:val="clear" w:color="auto" w:fill="FFFFFF"/>
+          </w:tcPr>
+          <w:p>
+            <w:pPr>
+              <w:jc w:val="center"/>
+              <w:spacing w:before="40" w:after="40"/>
+            </w:pPr>
+            <w:r>
+              <w:rPr>
+                <w:sz w:val="18"/>
+                <w:szCs w:val="18"/>
+                <w:rFonts w:hint="eastAsia" w:eastAsia="宋体" w:ascii="Times New Roman" w:hAnsi="Times New Roman"/>
+              </w:rPr>
+              <w:t xml:space="preserve">感应电机FIDVR</w:t>
+            </w:r>
+          </w:p>
+        </w:tc>
+        <w:tc>
+          <w:tcPr>
+            <w:tcW w:w="1850" w:type="dxa"/>
+            <w:shd w:val="clear" w:color="auto" w:fill="FFFFFF"/>
+          </w:tcPr>
+          <w:p>
+            <w:pPr>
+              <w:jc w:val="center"/>
+              <w:spacing w:before="40" w:after="40"/>
+            </w:pPr>
+            <w:r>
+              <w:rPr>
+                <w:sz w:val="18"/>
+                <w:szCs w:val="18"/>
+                <w:rFonts w:hint="eastAsia" w:eastAsia="宋体" w:ascii="Times New Roman" w:hAnsi="Times New Roman"/>
+              </w:rPr>
+              <w:t xml:space="preserve">★★★</w:t>
+            </w:r>
+          </w:p>
+        </w:tc>
+      </w:tr>
+      <w:tr>
+        <w:tc>
+          <w:tcPr>
+            <w:tcW w:w="1500" w:type="dxa"/>
+            <w:shd w:val="clear" w:color="auto" w:fill="EBF3FA"/>
+          </w:tcPr>
+          <w:p>
+            <w:pPr>
+              <w:jc w:val="center"/>
+              <w:spacing w:before="40" w:after="40"/>
+            </w:pPr>
+            <w:r>
+              <w:rPr>
+                <w:b/>
+                <w:bCs/>
+                <w:sz w:val="18"/>
+                <w:szCs w:val="18"/>
+                <w:rFonts w:hint="eastAsia" w:eastAsia="宋体" w:ascii="Times New Roman" w:hAnsi="Times New Roman"/>
+              </w:rPr>
+              <w:t xml:space="preserve">文献23（Lammert）</w:t>
+            </w:r>
+          </w:p>
+        </w:tc>
+        <w:tc>
+          <w:tcPr>
+            <w:tcW w:w="1850" w:type="dxa"/>
+            <w:shd w:val="clear" w:color="auto" w:fill="FFFFFF"/>
+          </w:tcPr>
+          <w:p>
+            <w:pPr>
+              <w:jc w:val="center"/>
+              <w:spacing w:before="40" w:after="40"/>
+            </w:pPr>
+            <w:r>
+              <w:rPr>
+                <w:sz w:val="18"/>
+                <w:szCs w:val="18"/>
+                <w:rFonts w:hint="eastAsia" w:eastAsia="宋体" w:ascii="Times New Roman" w:hAnsi="Times New Roman"/>
+              </w:rPr>
+              <w:t xml:space="preserve">PV逆变器LVRT电压恢复</w:t>
+            </w:r>
+          </w:p>
+        </w:tc>
+        <w:tc>
+          <w:tcPr>
+            <w:tcW w:w="1850" w:type="dxa"/>
+            <w:shd w:val="clear" w:color="auto" w:fill="FFFFFF"/>
+          </w:tcPr>
+          <w:p>
+            <w:pPr>
+              <w:jc w:val="center"/>
+              <w:spacing w:before="40" w:after="40"/>
+            </w:pPr>
+            <w:r>
+              <w:rPr>
+                <w:sz w:val="18"/>
+                <w:szCs w:val="18"/>
+                <w:rFonts w:hint="eastAsia" w:eastAsia="宋体" w:ascii="Times New Roman" w:hAnsi="Times New Roman"/>
+              </w:rPr>
+              <w:t xml:space="preserve">P-box：故障期建模</w:t>
+            </w:r>
+          </w:p>
+        </w:tc>
+        <w:tc>
+          <w:tcPr>
+            <w:tcW w:w="1850" w:type="dxa"/>
+            <w:shd w:val="clear" w:color="auto" w:fill="FFFFFF"/>
+          </w:tcPr>
+          <w:p>
+            <w:pPr>
+              <w:jc w:val="center"/>
+              <w:spacing w:before="40" w:after="40"/>
+            </w:pPr>
+            <w:r>
+              <w:rPr>
+                <w:sz w:val="18"/>
+                <w:szCs w:val="18"/>
+                <w:rFonts w:hint="eastAsia" w:eastAsia="宋体" w:ascii="Times New Roman" w:hAnsi="Times New Roman"/>
+              </w:rPr>
+              <w:t xml:space="preserve">高光伏ADN故障</w:t>
+            </w:r>
+          </w:p>
+        </w:tc>
+        <w:tc>
+          <w:tcPr>
+            <w:tcW w:w="1850" w:type="dxa"/>
+            <w:shd w:val="clear" w:color="auto" w:fill="FFFFFF"/>
+          </w:tcPr>
+          <w:p>
+            <w:pPr>
+              <w:jc w:val="center"/>
+              <w:spacing w:before="40" w:after="40"/>
+            </w:pPr>
+            <w:r>
+              <w:rPr>
+                <w:sz w:val="18"/>
+                <w:szCs w:val="18"/>
+                <w:rFonts w:hint="eastAsia" w:eastAsia="宋体" w:ascii="Times New Roman" w:hAnsi="Times New Roman"/>
+              </w:rPr>
+              <w:t xml:space="preserve">★★★</w:t>
+            </w:r>
+          </w:p>
+        </w:tc>
+      </w:tr>
+      <w:tr>
+        <w:tc>
+          <w:tcPr>
+            <w:tcW w:w="1500" w:type="dxa"/>
+            <w:shd w:val="clear" w:color="auto" w:fill="EBF3FA"/>
+          </w:tcPr>
+          <w:p>
+            <w:pPr>
+              <w:jc w:val="center"/>
+              <w:spacing w:before="40" w:after="40"/>
+            </w:pPr>
+            <w:r>
+              <w:rPr>
+                <w:b/>
+                <w:bCs/>
+                <w:sz w:val="18"/>
+                <w:szCs w:val="18"/>
+                <w:rFonts w:hint="eastAsia" w:eastAsia="宋体" w:ascii="Times New Roman" w:hAnsi="Times New Roman"/>
+              </w:rPr>
+              <w:t xml:space="preserve">文献22（Wang）</w:t>
+            </w:r>
+          </w:p>
+        </w:tc>
+        <w:tc>
+          <w:tcPr>
+            <w:tcW w:w="1850" w:type="dxa"/>
+            <w:shd w:val="clear" w:color="auto" w:fill="FFFFFF"/>
+          </w:tcPr>
+          <w:p>
+            <w:pPr>
+              <w:jc w:val="center"/>
+              <w:spacing w:before="40" w:after="40"/>
+            </w:pPr>
+            <w:r>
+              <w:rPr>
+                <w:sz w:val="18"/>
+                <w:szCs w:val="18"/>
+                <w:rFonts w:hint="eastAsia" w:eastAsia="宋体" w:ascii="Times New Roman" w:hAnsi="Times New Roman"/>
+              </w:rPr>
+              <w:t xml:space="preserve">自适应RLS灵敏度估计</w:t>
+            </w:r>
+          </w:p>
+        </w:tc>
+        <w:tc>
+          <w:tcPr>
+            <w:tcW w:w="1850" w:type="dxa"/>
+            <w:shd w:val="clear" w:color="auto" w:fill="FFFFFF"/>
+          </w:tcPr>
+          <w:p>
+            <w:pPr>
+              <w:jc w:val="center"/>
+              <w:spacing w:before="40" w:after="40"/>
+            </w:pPr>
+            <w:r>
+              <w:rPr>
+                <w:sz w:val="18"/>
+                <w:szCs w:val="18"/>
+                <w:rFonts w:hint="eastAsia" w:eastAsia="宋体" w:ascii="Times New Roman" w:hAnsi="Times New Roman"/>
+              </w:rPr>
+              <w:t xml:space="preserve">事中：S(t)重辨识</w:t>
+            </w:r>
+          </w:p>
+        </w:tc>
+        <w:tc>
+          <w:tcPr>
+            <w:tcW w:w="1850" w:type="dxa"/>
+            <w:shd w:val="clear" w:color="auto" w:fill="FFFFFF"/>
+          </w:tcPr>
+          <w:p>
+            <w:pPr>
+              <w:jc w:val="center"/>
+              <w:spacing w:before="40" w:after="40"/>
+            </w:pPr>
+            <w:r>
+              <w:rPr>
+                <w:sz w:val="18"/>
+                <w:szCs w:val="18"/>
+                <w:rFonts w:hint="eastAsia" w:eastAsia="宋体" w:ascii="Times New Roman" w:hAnsi="Times New Roman"/>
+              </w:rPr>
+              <w:t xml:space="preserve">拓扑突变失效场景</w:t>
+            </w:r>
+          </w:p>
+        </w:tc>
+        <w:tc>
+          <w:tcPr>
+            <w:tcW w:w="1850" w:type="dxa"/>
+            <w:shd w:val="clear" w:color="auto" w:fill="FFFFFF"/>
+          </w:tcPr>
+          <w:p>
+            <w:pPr>
+              <w:jc w:val="center"/>
+              <w:spacing w:before="40" w:after="40"/>
+            </w:pPr>
+            <w:r>
+              <w:rPr>
+                <w:sz w:val="18"/>
+                <w:szCs w:val="18"/>
+                <w:rFonts w:hint="eastAsia" w:eastAsia="宋体" w:ascii="Times New Roman" w:hAnsi="Times New Roman"/>
+              </w:rPr>
+              <w:t xml:space="preserve">★★</w:t>
+            </w:r>
+          </w:p>
+        </w:tc>
+      </w:tr>
+      <w:tr>
+        <w:tc>
+          <w:tcPr>
+            <w:tcW w:w="1500" w:type="dxa"/>
+            <w:shd w:val="clear" w:color="auto" w:fill="EBF3FA"/>
+          </w:tcPr>
+          <w:p>
+            <w:pPr>
+              <w:jc w:val="center"/>
+              <w:spacing w:before="40" w:after="40"/>
+            </w:pPr>
+            <w:r>
+              <w:rPr>
+                <w:b/>
+                <w:bCs/>
+                <w:sz w:val="18"/>
+                <w:szCs w:val="18"/>
+                <w:rFonts w:hint="eastAsia" w:eastAsia="宋体" w:ascii="Times New Roman" w:hAnsi="Times New Roman"/>
+              </w:rPr>
+              <w:t xml:space="preserve">文献3（Rayati）</w:t>
+            </w:r>
+          </w:p>
+        </w:tc>
+        <w:tc>
+          <w:tcPr>
+            <w:tcW w:w="1850" w:type="dxa"/>
+            <w:shd w:val="clear" w:color="auto" w:fill="FFFFFF"/>
+          </w:tcPr>
+          <w:p>
+            <w:pPr>
+              <w:jc w:val="center"/>
+              <w:spacing w:before="40" w:after="40"/>
+            </w:pPr>
+            <w:r>
+              <w:rPr>
+                <w:sz w:val="18"/>
+                <w:szCs w:val="18"/>
+                <w:rFonts w:hint="eastAsia" w:eastAsia="宋体" w:ascii="Times New Roman" w:hAnsi="Times New Roman"/>
+              </w:rPr>
+              <w:t xml:space="preserve">DR机会约束弹性优化</w:t>
+            </w:r>
+          </w:p>
+        </w:tc>
+        <w:tc>
+          <w:tcPr>
+            <w:tcW w:w="1850" w:type="dxa"/>
+            <w:shd w:val="clear" w:color="auto" w:fill="FFFFFF"/>
+          </w:tcPr>
+          <w:p>
+            <w:pPr>
+              <w:jc w:val="center"/>
+              <w:spacing w:before="40" w:after="40"/>
+            </w:pPr>
+            <w:r>
+              <w:rPr>
+                <w:sz w:val="18"/>
+                <w:szCs w:val="18"/>
+                <w:rFonts w:hint="eastAsia" w:eastAsia="宋体" w:ascii="Times New Roman" w:hAnsi="Times New Roman"/>
+              </w:rPr>
+              <w:t xml:space="preserve">预规划：N-1概率约束</w:t>
+            </w:r>
+          </w:p>
+        </w:tc>
+        <w:tc>
+          <w:tcPr>
+            <w:tcW w:w="1850" w:type="dxa"/>
+            <w:shd w:val="clear" w:color="auto" w:fill="FFFFFF"/>
+          </w:tcPr>
+          <w:p>
+            <w:pPr>
+              <w:jc w:val="center"/>
+              <w:spacing w:before="40" w:after="40"/>
+            </w:pPr>
+            <w:r>
+              <w:rPr>
+                <w:sz w:val="18"/>
+                <w:szCs w:val="18"/>
+                <w:rFonts w:hint="eastAsia" w:eastAsia="宋体" w:ascii="Times New Roman" w:hAnsi="Times New Roman"/>
+              </w:rPr>
+              <w:t xml:space="preserve">故障概率不确定</w:t>
+            </w:r>
+          </w:p>
+        </w:tc>
+        <w:tc>
+          <w:tcPr>
+            <w:tcW w:w="1850" w:type="dxa"/>
+            <w:shd w:val="clear" w:color="auto" w:fill="FFFFFF"/>
+          </w:tcPr>
+          <w:p>
+            <w:pPr>
+              <w:jc w:val="center"/>
+              <w:spacing w:before="40" w:after="40"/>
+            </w:pPr>
+            <w:r>
+              <w:rPr>
+                <w:sz w:val="18"/>
+                <w:szCs w:val="18"/>
+                <w:rFonts w:hint="eastAsia" w:eastAsia="宋体" w:ascii="Times New Roman" w:hAnsi="Times New Roman"/>
+              </w:rPr>
+              <w:t xml:space="preserve">★★</w:t>
+            </w:r>
+          </w:p>
+        </w:tc>
+      </w:tr>
+      <w:tr>
+        <w:tc>
+          <w:tcPr>
+            <w:tcW w:w="1500" w:type="dxa"/>
+            <w:shd w:val="clear" w:color="auto" w:fill="EBF3FA"/>
+          </w:tcPr>
+          <w:p>
+            <w:pPr>
+              <w:jc w:val="center"/>
+              <w:spacing w:before="40" w:after="40"/>
+            </w:pPr>
+            <w:r>
+              <w:rPr>
+                <w:b/>
+                <w:bCs/>
+                <w:sz w:val="18"/>
+                <w:szCs w:val="18"/>
+                <w:rFonts w:hint="eastAsia" w:eastAsia="宋体" w:ascii="Times New Roman" w:hAnsi="Times New Roman"/>
+              </w:rPr>
+              <w:t xml:space="preserve">文献20（Guo）</w:t>
+            </w:r>
+          </w:p>
+        </w:tc>
+        <w:tc>
+          <w:tcPr>
+            <w:tcW w:w="1850" w:type="dxa"/>
+            <w:shd w:val="clear" w:color="auto" w:fill="FFFFFF"/>
+          </w:tcPr>
+          <w:p>
+            <w:pPr>
+              <w:jc w:val="center"/>
+              <w:spacing w:before="40" w:after="40"/>
+            </w:pPr>
+            <w:r>
+              <w:rPr>
+                <w:sz w:val="18"/>
+                <w:szCs w:val="18"/>
+                <w:rFonts w:hint="eastAsia" w:eastAsia="宋体" w:ascii="Times New Roman" w:hAnsi="Times New Roman"/>
+              </w:rPr>
+              <w:t xml:space="preserve">多阶段鲁棒无功优化</w:t>
+            </w:r>
+          </w:p>
+        </w:tc>
+        <w:tc>
+          <w:tcPr>
+            <w:tcW w:w="1850" w:type="dxa"/>
+            <w:shd w:val="clear" w:color="auto" w:fill="FFFFFF"/>
+          </w:tcPr>
+          <w:p>
+            <w:pPr>
+              <w:jc w:val="center"/>
+              <w:spacing w:before="40" w:after="40"/>
+            </w:pPr>
+            <w:r>
+              <w:rPr>
+                <w:sz w:val="18"/>
+                <w:szCs w:val="18"/>
+                <w:rFonts w:hint="eastAsia" w:eastAsia="宋体" w:ascii="Times New Roman" w:hAnsi="Times New Roman"/>
+              </w:rPr>
+              <w:t xml:space="preserve">预规划：N-1时间耦合</w:t>
+            </w:r>
+          </w:p>
+        </w:tc>
+        <w:tc>
+          <w:tcPr>
+            <w:tcW w:w="1850" w:type="dxa"/>
+            <w:shd w:val="clear" w:color="auto" w:fill="FFFFFF"/>
+          </w:tcPr>
+          <w:p>
+            <w:pPr>
+              <w:jc w:val="center"/>
+              <w:spacing w:before="40" w:after="40"/>
+            </w:pPr>
+            <w:r>
+              <w:rPr>
+                <w:sz w:val="18"/>
+                <w:szCs w:val="18"/>
+                <w:rFonts w:hint="eastAsia" w:eastAsia="宋体" w:ascii="Times New Roman" w:hAnsi="Times New Roman"/>
+              </w:rPr>
+              <w:t xml:space="preserve">水电多时段N-1</w:t>
+            </w:r>
+          </w:p>
+        </w:tc>
+        <w:tc>
+          <w:tcPr>
+            <w:tcW w:w="1850" w:type="dxa"/>
+            <w:shd w:val="clear" w:color="auto" w:fill="FFFFFF"/>
+          </w:tcPr>
+          <w:p>
+            <w:pPr>
+              <w:jc w:val="center"/>
+              <w:spacing w:before="40" w:after="40"/>
+            </w:pPr>
+            <w:r>
+              <w:rPr>
+                <w:sz w:val="18"/>
+                <w:szCs w:val="18"/>
+                <w:rFonts w:hint="eastAsia" w:eastAsia="宋体" w:ascii="Times New Roman" w:hAnsi="Times New Roman"/>
+              </w:rPr>
+              <w:t xml:space="preserve">★★</w:t>
+            </w:r>
+          </w:p>
+        </w:tc>
+      </w:tr>
+      <w:tr>
+        <w:tc>
+          <w:tcPr>
+            <w:tcW w:w="1500" w:type="dxa"/>
+            <w:shd w:val="clear" w:color="auto" w:fill="EBF3FA"/>
+          </w:tcPr>
+          <w:p>
+            <w:pPr>
+              <w:jc w:val="center"/>
+              <w:spacing w:before="40" w:after="40"/>
+            </w:pPr>
+            <w:r>
+              <w:rPr>
+                <w:b/>
+                <w:bCs/>
+                <w:sz w:val="18"/>
+                <w:szCs w:val="18"/>
+                <w:rFonts w:hint="eastAsia" w:eastAsia="宋体" w:ascii="Times New Roman" w:hAnsi="Times New Roman"/>
+              </w:rPr>
+              <w:t xml:space="preserve">文献18（Zhang）</w:t>
+            </w:r>
+          </w:p>
+        </w:tc>
+        <w:tc>
+          <w:tcPr>
+            <w:tcW w:w="1850" w:type="dxa"/>
+            <w:shd w:val="clear" w:color="auto" w:fill="FFFFFF"/>
+          </w:tcPr>
+          <w:p>
+            <w:pPr>
+              <w:jc w:val="center"/>
+              <w:spacing w:before="40" w:after="40"/>
+            </w:pPr>
+            <w:r>
+              <w:rPr>
+                <w:sz w:val="18"/>
+                <w:szCs w:val="18"/>
+                <w:rFonts w:hint="eastAsia" w:eastAsia="宋体" w:ascii="Times New Roman" w:hAnsi="Times New Roman"/>
+              </w:rPr>
+              <w:t xml:space="preserve">三阶段层级Volt-Var控制</w:t>
+            </w:r>
+          </w:p>
+        </w:tc>
+        <w:tc>
+          <w:tcPr>
+            <w:tcW w:w="1850" w:type="dxa"/>
+            <w:shd w:val="clear" w:color="auto" w:fill="FFFFFF"/>
+          </w:tcPr>
+          <w:p>
+            <w:pPr>
+              <w:jc w:val="center"/>
+              <w:spacing w:before="40" w:after="40"/>
+            </w:pPr>
+            <w:r>
+              <w:rPr>
+                <w:sz w:val="18"/>
+                <w:szCs w:val="18"/>
+                <w:rFonts w:hint="eastAsia" w:eastAsia="宋体" w:ascii="Times New Roman" w:hAnsi="Times New Roman"/>
+              </w:rPr>
+              <w:t xml:space="preserve">框架时间尺度分解</w:t>
+            </w:r>
+          </w:p>
+        </w:tc>
+        <w:tc>
+          <w:tcPr>
+            <w:tcW w:w="1850" w:type="dxa"/>
+            <w:shd w:val="clear" w:color="auto" w:fill="FFFFFF"/>
+          </w:tcPr>
+          <w:p>
+            <w:pPr>
+              <w:jc w:val="center"/>
+              <w:spacing w:before="40" w:after="40"/>
+            </w:pPr>
+            <w:r>
+              <w:rPr>
+                <w:sz w:val="18"/>
+                <w:szCs w:val="18"/>
+                <w:rFonts w:hint="eastAsia" w:eastAsia="宋体" w:ascii="Times New Roman" w:hAnsi="Times New Roman"/>
+              </w:rPr>
+              <w:t xml:space="preserve">层级协调故障响应</w:t>
+            </w:r>
+          </w:p>
+        </w:tc>
+        <w:tc>
+          <w:tcPr>
+            <w:tcW w:w="1850" w:type="dxa"/>
+            <w:shd w:val="clear" w:color="auto" w:fill="FFFFFF"/>
+          </w:tcPr>
+          <w:p>
+            <w:pPr>
+              <w:jc w:val="center"/>
+              <w:spacing w:before="40" w:after="40"/>
+            </w:pPr>
+            <w:r>
+              <w:rPr>
+                <w:sz w:val="18"/>
+                <w:szCs w:val="18"/>
+                <w:rFonts w:hint="eastAsia" w:eastAsia="宋体" w:ascii="Times New Roman" w:hAnsi="Times New Roman"/>
+              </w:rPr>
+              <w:t xml:space="preserve">★★</w:t>
+            </w:r>
+          </w:p>
+        </w:tc>
+      </w:tr>
+      <w:tr>
+        <w:tc>
+          <w:tcPr>
+            <w:tcW w:w="1500" w:type="dxa"/>
+            <w:shd w:val="clear" w:color="auto" w:fill="EBF3FA"/>
+          </w:tcPr>
+          <w:p>
+            <w:pPr>
+              <w:jc w:val="center"/>
+              <w:spacing w:before="40" w:after="40"/>
+            </w:pPr>
+            <w:r>
+              <w:rPr>
+                <w:b/>
+                <w:bCs/>
+                <w:sz w:val="18"/>
+                <w:szCs w:val="18"/>
+                <w:rFonts w:hint="eastAsia" w:eastAsia="宋体" w:ascii="Times New Roman" w:hAnsi="Times New Roman"/>
+              </w:rPr>
+              <w:t xml:space="preserve">文献25（Li）</w:t>
+            </w:r>
+          </w:p>
+        </w:tc>
+        <w:tc>
+          <w:tcPr>
+            <w:tcW w:w="1850" w:type="dxa"/>
+            <w:shd w:val="clear" w:color="auto" w:fill="FFFFFF"/>
+          </w:tcPr>
+          <w:p>
+            <w:pPr>
+              <w:jc w:val="center"/>
+              <w:spacing w:before="40" w:after="40"/>
+            </w:pPr>
+            <w:r>
+              <w:rPr>
+                <w:sz w:val="18"/>
+                <w:szCs w:val="18"/>
+                <w:rFonts w:hint="eastAsia" w:eastAsia="宋体" w:ascii="Times New Roman" w:hAnsi="Times New Roman"/>
+              </w:rPr>
+              <w:t xml:space="preserve">DR-MPC静/动态不确定性</w:t>
+            </w:r>
+          </w:p>
+        </w:tc>
+        <w:tc>
+          <w:tcPr>
+            <w:tcW w:w="1850" w:type="dxa"/>
+            <w:shd w:val="clear" w:color="auto" w:fill="FFFFFF"/>
+          </w:tcPr>
+          <w:p>
+            <w:pPr>
+              <w:jc w:val="center"/>
+              <w:spacing w:before="40" w:after="40"/>
+            </w:pPr>
+            <w:r>
+              <w:rPr>
+                <w:sz w:val="18"/>
+                <w:szCs w:val="18"/>
+                <w:rFonts w:hint="eastAsia" w:eastAsia="宋体" w:ascii="Times New Roman" w:hAnsi="Times New Roman"/>
+              </w:rPr>
+              <w:t xml:space="preserve">预规划：故障动态建模</w:t>
+            </w:r>
+          </w:p>
+        </w:tc>
+        <w:tc>
+          <w:tcPr>
+            <w:tcW w:w="1850" w:type="dxa"/>
+            <w:shd w:val="clear" w:color="auto" w:fill="FFFFFF"/>
+          </w:tcPr>
+          <w:p>
+            <w:pPr>
+              <w:jc w:val="center"/>
+              <w:spacing w:before="40" w:after="40"/>
+            </w:pPr>
+            <w:r>
+              <w:rPr>
+                <w:sz w:val="18"/>
+                <w:szCs w:val="18"/>
+                <w:rFonts w:hint="eastAsia" w:eastAsia="宋体" w:ascii="Times New Roman" w:hAnsi="Times New Roman"/>
+              </w:rPr>
+              <w:t xml:space="preserve">DR-MPC弹性裕度</w:t>
+            </w:r>
+          </w:p>
+        </w:tc>
+        <w:tc>
+          <w:tcPr>
+            <w:tcW w:w="1850" w:type="dxa"/>
+            <w:shd w:val="clear" w:color="auto" w:fill="FFFFFF"/>
+          </w:tcPr>
+          <w:p>
+            <w:pPr>
+              <w:jc w:val="center"/>
+              <w:spacing w:before="40" w:after="40"/>
+            </w:pPr>
+            <w:r>
+              <w:rPr>
+                <w:sz w:val="18"/>
+                <w:szCs w:val="18"/>
+                <w:rFonts w:hint="eastAsia" w:eastAsia="宋体" w:ascii="Times New Roman" w:hAnsi="Times New Roman"/>
+              </w:rPr>
+              <w:t xml:space="preserve">★★</w:t>
+            </w:r>
+          </w:p>
+        </w:tc>
+      </w:tr>
+    </w:tbl>
+    <w:p>
+      <w:pPr>
+        <w:jc w:val="both"/>
+        <w:spacing w:before="0" w:after="60"/>
+      </w:pPr>
+    </w:p>
+    <w:p>
+      <w:pPr>
+        <w:pBdr>
+          <w:bottom w:val="single" w:sz="6" w:space="1" w:color="2E75B6"/>
+        </w:pBdr>
+        <w:spacing w:before="120" w:after="120"/>
+      </w:pPr>
+    </w:p>
+    <w:p>
+      <w:pPr>
+        <w:jc w:val="left"/>
+        <w:spacing w:before="200" w:after="80"/>
+      </w:pPr>
+      <w:r>
+        <w:rPr>
+          <w:b/>
+          <w:bCs/>
+          <w:sz w:val="30"/>
+          <w:szCs w:val="30"/>
+          <w:color w:val="1F3864"/>
+          <w:rFonts w:hint="eastAsia" w:eastAsia="宋体" w:ascii="Times New Roman" w:hAnsi="Times New Roman"/>
+        </w:rPr>
         <w:t xml:space="preserve">参考文献</w:t>
       </w:r>
     </w:p>
@@ -5600,6 +9717,111 @@
           <w:rFonts w:hint="eastAsia" w:eastAsia="宋体" w:ascii="Times New Roman" w:hAnsi="Times New Roman"/>
         </w:rPr>
         <w:t xml:space="preserve">[4]  Wang H, Liang Y, Yao Y, et al. Online model-free DER dispatch via adaptive voltage sensitivity estimation and chance constrained programming [J]. IEEE Transactions on Power Systems, 2024, 39(6): 7317-7330. DOI: 10.1109/TPWRS.2024.3369632.</w:t>
+      </w:r>
+    </w:p>
+    <w:p>
+      <w:pPr>
+        <w:jc w:val="both"/>
+        <w:spacing w:before="0" w:after="60"/>
+        <w:ind w:left="360" w:firstLine="-360"/>
+      </w:pPr>
+      <w:r>
+        <w:rPr>
+          <w:sz w:val="18"/>
+          <w:szCs w:val="18"/>
+          <w:rFonts w:hint="eastAsia" w:eastAsia="宋体" w:ascii="Times New Roman" w:hAnsi="Times New Roman"/>
+        </w:rPr>
+        <w:t xml:space="preserve">[5]  Wang B, Yang T, Luo X, et al. Topology-switching soft open point assisted real-time cooperative operation of active distribution networks [J]. Modern Power Systems and Clean Energy, 2024.</w:t>
+      </w:r>
+    </w:p>
+    <w:p>
+      <w:pPr>
+        <w:jc w:val="both"/>
+        <w:spacing w:before="0" w:after="60"/>
+        <w:ind w:left="360" w:firstLine="-360"/>
+      </w:pPr>
+      <w:r>
+        <w:rPr>
+          <w:sz w:val="18"/>
+          <w:szCs w:val="18"/>
+          <w:rFonts w:hint="eastAsia" w:eastAsia="宋体" w:ascii="Times New Roman" w:hAnsi="Times New Roman"/>
+        </w:rPr>
+        <w:t xml:space="preserve">[6]  Park B, Yang L, Tompaidis D T, et al. Mitigation of motor stalling and FIDVR via energy storage systems with signal temporal logic [J]. IEEE Transactions on Power Systems, 2021, 36(6): 5241-5252.</w:t>
+      </w:r>
+    </w:p>
+    <w:p>
+      <w:pPr>
+        <w:jc w:val="both"/>
+        <w:spacing w:before="0" w:after="60"/>
+        <w:ind w:left="360" w:firstLine="-360"/>
+      </w:pPr>
+      <w:r>
+        <w:rPr>
+          <w:sz w:val="18"/>
+          <w:szCs w:val="18"/>
+          <w:rFonts w:hint="eastAsia" w:eastAsia="宋体" w:ascii="Times New Roman" w:hAnsi="Times New Roman"/>
+        </w:rPr>
+        <w:t xml:space="preserve">[7]  Lammert G, Ospina L F, Pourbeik P, et al. Control of photovoltaic systems for enhanced short-term voltage stability and recovery [J]. IEEE Transactions on Energy Conversion, 2019, 34(1): 243-254.</w:t>
+      </w:r>
+    </w:p>
+    <w:p>
+      <w:pPr>
+        <w:jc w:val="both"/>
+        <w:spacing w:before="0" w:after="60"/>
+        <w:ind w:left="360" w:firstLine="-360"/>
+      </w:pPr>
+      <w:r>
+        <w:rPr>
+          <w:sz w:val="18"/>
+          <w:szCs w:val="18"/>
+          <w:rFonts w:hint="eastAsia" w:eastAsia="宋体" w:ascii="Times New Roman" w:hAnsi="Times New Roman"/>
+        </w:rPr>
+        <w:t xml:space="preserve">[8]  Rayati M, Ranjbar A M, Chevalier S, et al. Distributionally robust chance constrained optimization for providing flexibility in an active distribution network [J]. IEEE Transactions on Smart Grid, 2022, 13(6): 4870-4884.</w:t>
+      </w:r>
+    </w:p>
+    <w:p>
+      <w:pPr>
+        <w:jc w:val="both"/>
+        <w:spacing w:before="0" w:after="60"/>
+        <w:ind w:left="360" w:firstLine="-360"/>
+      </w:pPr>
+      <w:r>
+        <w:rPr>
+          <w:sz w:val="18"/>
+          <w:szCs w:val="18"/>
+          <w:rFonts w:hint="eastAsia" w:eastAsia="宋体" w:ascii="Times New Roman" w:hAnsi="Times New Roman"/>
+        </w:rPr>
+        <w:t xml:space="preserve">[9]  Guo Z, Liu Z, Tang W, et al. Multi-stage robust reactive power optimization in active distribution networks with discrete intertemporal constraints [J]. IEEE Transactions on Power Systems, 2025, 40(1): 389-402.</w:t>
+      </w:r>
+    </w:p>
+    <w:p>
+      <w:pPr>
+        <w:jc w:val="both"/>
+        <w:spacing w:before="0" w:after="60"/>
+        <w:ind w:left="360" w:firstLine="-360"/>
+      </w:pPr>
+      <w:r>
+        <w:rPr>
+          <w:sz w:val="18"/>
+          <w:szCs w:val="18"/>
+          <w:rFonts w:hint="eastAsia" w:eastAsia="宋体" w:ascii="Times New Roman" w:hAnsi="Times New Roman"/>
+        </w:rPr>
+        <w:t xml:space="preserve">[10] Zhang C, Xu Y, Zhao J, et al. Three-stage hierarchically-coordinated voltage/Var control based on PV inverters considering distribution network reconfiguration [J]. IEEE Transactions on Sustainable Energy, 2022, 13(2): 868-881.</w:t>
+      </w:r>
+    </w:p>
+    <w:p>
+      <w:pPr>
+        <w:jc w:val="both"/>
+        <w:spacing w:before="0" w:after="60"/>
+        <w:ind w:left="360" w:firstLine="-360"/>
+      </w:pPr>
+      <w:r>
+        <w:rPr>
+          <w:sz w:val="18"/>
+          <w:szCs w:val="18"/>
+          <w:rFonts w:hint="eastAsia" w:eastAsia="宋体" w:ascii="Times New Roman" w:hAnsi="Times New Roman"/>
+        </w:rPr>
+        <w:t xml:space="preserve">[11] Li Q, Gao W, Zhang H, et al. A distributionally robust model predictive control for static and dynamic uncertainties in smart grids [J]. IEEE Transactions on Smart Grid, 2024, 15(3): 2858-2871.</w:t>
       </w:r>
     </w:p>
     <w:p>

</xml_diff>